<commit_message>
Final edits for syllabus/short guide
</commit_message>
<xml_diff>
--- a/TechComm/semester/2026-08-Fall/2026-Fall-Short Guide.docx
+++ b/TechComm/semester/2026-08-Fall/2026-Fall-Short Guide.docx
@@ -88,7 +88,21 @@
           <w:sz w:val="18"/>
           <w:szCs w:val="18"/>
         </w:rPr>
-        <w:t>August 6</w:t>
+        <w:t xml:space="preserve">August </w:t>
+      </w:r>
+      <w:r>
+        <w:rPr>
+          <w:sz w:val="18"/>
+          <w:szCs w:val="18"/>
+        </w:rPr>
+        <w:t>1</w:t>
+      </w:r>
+      <w:r>
+        <w:rPr>
+          <w:sz w:val="18"/>
+          <w:szCs w:val="18"/>
+        </w:rPr>
+        <w:t>6</w:t>
       </w:r>
       <w:r>
         <w:rPr>
@@ -311,19 +325,7 @@
           <w:rPr>
             <w:rStyle w:val="Hyperlink"/>
           </w:rPr>
-          <w:t>Grading P</w:t>
-        </w:r>
-        <w:r>
-          <w:rPr>
-            <w:rStyle w:val="Hyperlink"/>
-          </w:rPr>
-          <w:t>r</w:t>
-        </w:r>
-        <w:r>
-          <w:rPr>
-            <w:rStyle w:val="Hyperlink"/>
-          </w:rPr>
-          <w:t>ocess</w:t>
+          <w:t>Grading Process</w:t>
         </w:r>
       </w:hyperlink>
     </w:p>
@@ -476,22 +478,18 @@
       <w:r>
         <w:t>, #</w:t>
       </w:r>
-      <w:proofErr w:type="gramStart"/>
       <w:r>
         <w:t>85455</w:t>
       </w:r>
       <w:r>
         <w:t>, #</w:t>
       </w:r>
-      <w:proofErr w:type="gramEnd"/>
       <w:r>
         <w:t>85465</w:t>
       </w:r>
-      <w:proofErr w:type="gramStart"/>
       <w:r>
         <w:t>, &amp; #</w:t>
       </w:r>
-      <w:proofErr w:type="gramEnd"/>
       <w:r>
         <w:t>85467</w:t>
       </w:r>
@@ -1406,6 +1404,94 @@
         <w:pStyle w:val="Heading2"/>
       </w:pPr>
       <w:r>
+        <w:rPr>
+          <w:noProof/>
+        </w:rPr>
+        <mc:AlternateContent>
+          <mc:Choice Requires="wps">
+            <w:drawing>
+              <wp:anchor distT="0" distB="0" distL="114300" distR="114300" simplePos="0" relativeHeight="251692032" behindDoc="1" locked="0" layoutInCell="1" allowOverlap="1" wp14:anchorId="62F24CFF" wp14:editId="7864A65A">
+                <wp:simplePos x="0" y="0"/>
+                <wp:positionH relativeFrom="column">
+                  <wp:posOffset>19050</wp:posOffset>
+                </wp:positionH>
+                <wp:positionV relativeFrom="paragraph">
+                  <wp:posOffset>361315</wp:posOffset>
+                </wp:positionV>
+                <wp:extent cx="6400800" cy="1771650"/>
+                <wp:effectExtent l="0" t="0" r="19050" b="19050"/>
+                <wp:wrapNone/>
+                <wp:docPr id="934548704" name="Rectangle 11">
+                  <a:extLst xmlns:a="http://schemas.openxmlformats.org/drawingml/2006/main">
+                    <a:ext uri="{C183D7F6-B498-43B3-948B-1728B52AA6E4}">
+                      <adec:decorative xmlns:adec="http://schemas.microsoft.com/office/drawing/2017/decorative" val="1"/>
+                    </a:ext>
+                  </a:extLst>
+                </wp:docPr>
+                <wp:cNvGraphicFramePr/>
+                <a:graphic xmlns:a="http://schemas.openxmlformats.org/drawingml/2006/main">
+                  <a:graphicData uri="http://schemas.microsoft.com/office/word/2010/wordprocessingShape">
+                    <wps:wsp>
+                      <wps:cNvSpPr/>
+                      <wps:spPr>
+                        <a:xfrm>
+                          <a:off x="0" y="0"/>
+                          <a:ext cx="6400800" cy="1771650"/>
+                        </a:xfrm>
+                        <a:prstGeom prst="rect">
+                          <a:avLst/>
+                        </a:prstGeom>
+                        <a:solidFill>
+                          <a:srgbClr val="EDF3F4"/>
+                        </a:solidFill>
+                        <a:ln>
+                          <a:solidFill>
+                            <a:srgbClr val="508590"/>
+                          </a:solidFill>
+                        </a:ln>
+                      </wps:spPr>
+                      <wps:style>
+                        <a:lnRef idx="2">
+                          <a:schemeClr val="accent1">
+                            <a:shade val="15000"/>
+                          </a:schemeClr>
+                        </a:lnRef>
+                        <a:fillRef idx="1">
+                          <a:schemeClr val="accent1"/>
+                        </a:fillRef>
+                        <a:effectRef idx="0">
+                          <a:schemeClr val="accent1"/>
+                        </a:effectRef>
+                        <a:fontRef idx="minor">
+                          <a:schemeClr val="lt1"/>
+                        </a:fontRef>
+                      </wps:style>
+                      <wps:bodyPr rot="0" spcFirstLastPara="0" vertOverflow="overflow" horzOverflow="overflow" vert="horz" wrap="square" lIns="91440" tIns="45720" rIns="91440" bIns="45720" numCol="1" spcCol="0" rtlCol="0" fromWordArt="0" anchor="ctr" anchorCtr="0" forceAA="0" compatLnSpc="1">
+                        <a:prstTxWarp prst="textNoShape">
+                          <a:avLst/>
+                        </a:prstTxWarp>
+                        <a:noAutofit/>
+                      </wps:bodyPr>
+                    </wps:wsp>
+                  </a:graphicData>
+                </a:graphic>
+                <wp14:sizeRelH relativeFrom="margin">
+                  <wp14:pctWidth>0</wp14:pctWidth>
+                </wp14:sizeRelH>
+                <wp14:sizeRelV relativeFrom="margin">
+                  <wp14:pctHeight>0</wp14:pctHeight>
+                </wp14:sizeRelV>
+              </wp:anchor>
+            </w:drawing>
+          </mc:Choice>
+          <mc:Fallback>
+            <w:pict>
+              <v:rect w14:anchorId="1107991A" id="Rectangle 11" o:spid="_x0000_s1026" alt="&quot;&quot;" style="position:absolute;margin-left:1.5pt;margin-top:28.45pt;width:7in;height:139.5pt;z-index:-251624448;visibility:visible;mso-wrap-style:square;mso-width-percent:0;mso-height-percent:0;mso-wrap-distance-left:9pt;mso-wrap-distance-top:0;mso-wrap-distance-right:9pt;mso-wrap-distance-bottom:0;mso-position-horizontal:absolute;mso-position-horizontal-relative:text;mso-position-vertical:absolute;mso-position-vertical-relative:text;mso-width-percent:0;mso-height-percent:0;mso-width-relative:margin;mso-height-relative:margin;v-text-anchor:middle" o:gfxdata="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" fillcolor="#edf3f4" strokecolor="#508590" strokeweight="2pt"/>
+            </w:pict>
+          </mc:Fallback>
+        </mc:AlternateContent>
+      </w:r>
+      <w:r>
         <w:t>Questions</w:t>
       </w:r>
       <w:r>
@@ -1415,30 +1501,92 @@
     <w:p>
       <w:pPr>
         <w:pStyle w:val="Heading3"/>
-        <w:pBdr>
-          <w:top w:val="single" w:sz="24" w:space="1" w:color="508590"/>
-          <w:left w:val="single" w:sz="24" w:space="4" w:color="508590"/>
-          <w:bottom w:val="single" w:sz="24" w:space="1" w:color="508590"/>
-          <w:right w:val="single" w:sz="24" w:space="4" w:color="508590"/>
-        </w:pBdr>
         <w:tabs>
           <w:tab w:val="left" w:pos="9720"/>
         </w:tabs>
         <w:ind w:right="90"/>
       </w:pPr>
       <w:r>
-        <w:t xml:space="preserve">Discussion Board </w:t>
+        <w:rPr>
+          <w:noProof/>
+        </w:rPr>
+        <w:drawing>
+          <wp:anchor distT="0" distB="0" distL="114300" distR="114300" simplePos="0" relativeHeight="251689984" behindDoc="1" locked="0" layoutInCell="1" allowOverlap="1" wp14:anchorId="0481A3B1" wp14:editId="5304A052">
+            <wp:simplePos x="0" y="0"/>
+            <wp:positionH relativeFrom="column">
+              <wp:posOffset>4810125</wp:posOffset>
+            </wp:positionH>
+            <wp:positionV relativeFrom="paragraph">
+              <wp:posOffset>110490</wp:posOffset>
+            </wp:positionV>
+            <wp:extent cx="1514475" cy="1514475"/>
+            <wp:effectExtent l="0" t="0" r="9525" b="9525"/>
+            <wp:wrapTight wrapText="bothSides">
+              <wp:wrapPolygon edited="0">
+                <wp:start x="0" y="0"/>
+                <wp:lineTo x="0" y="21464"/>
+                <wp:lineTo x="21464" y="21464"/>
+                <wp:lineTo x="21464" y="0"/>
+                <wp:lineTo x="0" y="0"/>
+              </wp:wrapPolygon>
+            </wp:wrapTight>
+            <wp:docPr id="1865082654" name="Picture 28"/>
+            <wp:cNvGraphicFramePr>
+              <a:graphicFrameLocks xmlns:a="http://schemas.openxmlformats.org/drawingml/2006/main" noChangeAspect="1"/>
+            </wp:cNvGraphicFramePr>
+            <a:graphic xmlns:a="http://schemas.openxmlformats.org/drawingml/2006/main">
+              <a:graphicData uri="http://schemas.openxmlformats.org/drawingml/2006/picture">
+                <pic:pic xmlns:pic="http://schemas.openxmlformats.org/drawingml/2006/picture">
+                  <pic:nvPicPr>
+                    <pic:cNvPr id="1865082654" name="Picture 1865082654"/>
+                    <pic:cNvPicPr/>
+                  </pic:nvPicPr>
+                  <pic:blipFill>
+                    <a:blip r:embed="rId15">
+                      <a:extLst>
+                        <a:ext uri="{28A0092B-C50C-407E-A947-70E740481C1C}">
+                          <a14:useLocalDpi xmlns:a14="http://schemas.microsoft.com/office/drawing/2010/main" val="0"/>
+                        </a:ext>
+                      </a:extLst>
+                    </a:blip>
+                    <a:stretch>
+                      <a:fillRect/>
+                    </a:stretch>
+                  </pic:blipFill>
+                  <pic:spPr>
+                    <a:xfrm>
+                      <a:off x="0" y="0"/>
+                      <a:ext cx="1514475" cy="1514475"/>
+                    </a:xfrm>
+                    <a:prstGeom prst="rect">
+                      <a:avLst/>
+                    </a:prstGeom>
+                  </pic:spPr>
+                </pic:pic>
+              </a:graphicData>
+            </a:graphic>
+            <wp14:sizeRelH relativeFrom="margin">
+              <wp14:pctWidth>0</wp14:pctWidth>
+            </wp14:sizeRelH>
+            <wp14:sizeRelV relativeFrom="margin">
+              <wp14:pctHeight>0</wp14:pctHeight>
+            </wp14:sizeRelV>
+          </wp:anchor>
+        </w:drawing>
+      </w:r>
+      <w:r>
+        <w:rPr>
+          <w:noProof/>
+        </w:rPr>
+        <w:t>HokieBot's Tech Writing Notebook</w:t>
+      </w:r>
+      <w:r>
+        <w:t>, Fall 2026</w:t>
       </w:r>
     </w:p>
     <w:p>
       <w:pPr>
         <w:pStyle w:val="BodyText"/>
-        <w:pBdr>
-          <w:top w:val="single" w:sz="24" w:space="1" w:color="508590"/>
-          <w:left w:val="single" w:sz="24" w:space="4" w:color="508590"/>
-          <w:bottom w:val="single" w:sz="24" w:space="1" w:color="508590"/>
-          <w:right w:val="single" w:sz="24" w:space="4" w:color="508590"/>
-        </w:pBdr>
         <w:tabs>
           <w:tab w:val="left" w:pos="9720"/>
         </w:tabs>
@@ -1446,69 +1594,56 @@
         <w:ind w:left="180" w:right="90"/>
       </w:pPr>
       <w:r>
-        <w:t xml:space="preserve">Post your questions in the </w:t>
-      </w:r>
-      <w:hyperlink r:id="rId15" w:history="1">
+        <w:t>Ask</w:t>
+      </w:r>
+      <w:r>
+        <w:t xml:space="preserve"> your questions in the </w:t>
+      </w:r>
+      <w:hyperlink r:id="rId16" w:history="1">
         <w:r>
           <w:rPr>
             <w:rStyle w:val="Hyperlink"/>
-            <w:highlight w:val="yellow"/>
           </w:rPr>
-          <w:t>General Q&amp;A Discussion Board</w:t>
+          <w:t>Gemini Notebook for the course</w:t>
         </w:r>
       </w:hyperlink>
       <w:r>
-        <w:t xml:space="preserve"> in Canvas so anyone who knows the answer can help you. You can also check the General Q&amp;A Discussion Board for questions that have already been answered.</w:t>
+        <w:t xml:space="preserve">. I have added the course syllabus, course policies, major assignments, and other supporting documents to the Notebook. </w:t>
       </w:r>
     </w:p>
     <w:p>
       <w:pPr>
         <w:pStyle w:val="BodyText"/>
-        <w:pBdr>
-          <w:top w:val="single" w:sz="24" w:space="1" w:color="508590"/>
-          <w:left w:val="single" w:sz="24" w:space="4" w:color="508590"/>
-          <w:bottom w:val="single" w:sz="24" w:space="1" w:color="508590"/>
-          <w:right w:val="single" w:sz="24" w:space="4" w:color="508590"/>
-        </w:pBdr>
         <w:tabs>
           <w:tab w:val="left" w:pos="9720"/>
         </w:tabs>
-        <w:spacing w:after="120"/>
+        <w:spacing w:after="240"/>
         <w:ind w:left="180" w:right="90"/>
       </w:pPr>
       <w:r>
-        <w:t xml:space="preserve">If no one else answers your question, I usually respond </w:t>
-      </w:r>
-      <w:r>
-        <w:rPr>
-          <w:b/>
-          <w:bCs/>
-        </w:rPr>
-        <w:t xml:space="preserve">within 24 to </w:t>
-      </w:r>
-      <w:r>
-        <w:rPr>
-          <w:b/>
-          <w:bCs/>
-        </w:rPr>
-        <w:t>4</w:t>
-      </w:r>
-      <w:r>
-        <w:rPr>
-          <w:b/>
-          <w:bCs/>
-        </w:rPr>
-        <w:t xml:space="preserve">8 hours on class days. </w:t>
-      </w:r>
-      <w:r>
-        <w:rPr>
-          <w:b/>
-          <w:bCs/>
-        </w:rPr>
-        <w:t>I take holidays and weekends off</w:t>
-      </w:r>
-      <w:r>
-        <w:t xml:space="preserve"> and reply on the next class day.</w:t>
+        <w:t xml:space="preserve">Most </w:t>
+      </w:r>
+      <w:proofErr w:type="gramStart"/>
+      <w:r>
+        <w:t>frequently-asked</w:t>
+      </w:r>
+      <w:proofErr w:type="gramEnd"/>
+      <w:r>
+        <w:t xml:space="preserve"> questions can be answered by searching </w:t>
+      </w:r>
+      <w:proofErr w:type="spellStart"/>
+      <w:r>
+        <w:t>HokieBot</w:t>
+      </w:r>
+      <w:r>
+        <w:t>’s</w:t>
+      </w:r>
+      <w:proofErr w:type="spellEnd"/>
+      <w:r>
+        <w:t xml:space="preserve"> Notebook</w:t>
+      </w:r>
+      <w:r>
+        <w:t>. Check here first. It’s faster than waiting for Traci to answer your email.</w:t>
       </w:r>
     </w:p>
     <w:p>
@@ -1552,7 +1687,7 @@
       <w:r>
         <w:t xml:space="preserve">Visit the </w:t>
       </w:r>
-      <w:hyperlink r:id="rId16" w:history="1">
+      <w:hyperlink r:id="rId17" w:history="1">
         <w:r>
           <w:rPr>
             <w:rStyle w:val="Hyperlink"/>
@@ -1564,7 +1699,7 @@
       <w:r>
         <w:t xml:space="preserve"> on the second floor of Newman Library. You can talk to a tutor if you have a draft, an outline, or just ideas. Bring your assignment description with you. Make appointments online by setting up an account with </w:t>
       </w:r>
-      <w:hyperlink r:id="rId17" w:history="1">
+      <w:hyperlink r:id="rId18" w:history="1">
         <w:proofErr w:type="spellStart"/>
         <w:r>
           <w:rPr>
@@ -1644,7 +1779,7 @@
       <w:r>
         <w:t xml:space="preserve">Send your message to </w:t>
       </w:r>
-      <w:hyperlink r:id="rId18" w:history="1">
+      <w:hyperlink r:id="rId19" w:history="1">
         <w:r>
           <w:rPr>
             <w:rStyle w:val="Hyperlink"/>
@@ -1742,7 +1877,7 @@
       <w:r>
         <w:t xml:space="preserve">Visit my </w:t>
       </w:r>
-      <w:hyperlink r:id="rId19" w:history="1">
+      <w:hyperlink r:id="rId20" w:history="1">
         <w:r>
           <w:rPr>
             <w:rStyle w:val="Hyperlink"/>
@@ -2232,7 +2367,7 @@
                     <pic:cNvPicPr/>
                   </pic:nvPicPr>
                   <pic:blipFill>
-                    <a:blip r:embed="rId20" cstate="print"/>
+                    <a:blip r:embed="rId21" cstate="print"/>
                     <a:stretch>
                       <a:fillRect/>
                     </a:stretch>
@@ -2409,7 +2544,7 @@
         <w:ind w:right="90"/>
       </w:pPr>
       <w:r>
-        <w:t xml:space="preserve">A Module introduction page </w:t>
+        <w:t>A Module introduction page</w:t>
       </w:r>
     </w:p>
     <w:p>
@@ -2452,26 +2587,49 @@
         </w:rPr>
       </w:pPr>
       <w:r>
-        <w:t>To access each module, click on Modules in the left menu in Canvas</w:t>
-      </w:r>
-      <w:r>
-        <w:t xml:space="preserve">, and then </w:t>
+        <w:t xml:space="preserve">To access each module, click on </w:t>
       </w:r>
       <w:r>
         <w:rPr>
           <w:b/>
           <w:bCs/>
         </w:rPr>
-        <w:t>b</w:t>
+        <w:t>Modules</w:t>
+      </w:r>
+      <w:r>
+        <w:t xml:space="preserve"> in the left menu in Canvas</w:t>
+      </w:r>
+      <w:r>
+        <w:t xml:space="preserve">, and then </w:t>
       </w:r>
       <w:r>
         <w:rPr>
           <w:b/>
           <w:bCs/>
-        </w:rPr>
-        <w:t>egin with the Module introduction page</w:t>
-      </w:r>
-      <w:r>
+          <w:color w:val="C64600"/>
+        </w:rPr>
+        <w:t xml:space="preserve">begin with the Module </w:t>
+      </w:r>
+      <w:r>
+        <w:rPr>
+          <w:b/>
+          <w:bCs/>
+          <w:color w:val="C64600"/>
+        </w:rPr>
+        <w:t>I</w:t>
+      </w:r>
+      <w:r>
+        <w:rPr>
+          <w:b/>
+          <w:bCs/>
+          <w:color w:val="C64600"/>
+        </w:rPr>
+        <w:t>ntroduction page</w:t>
+      </w:r>
+      <w:r>
+        <w:rPr>
+          <w:color w:val="C64600"/>
+        </w:rPr>
         <w:t>.</w:t>
       </w:r>
       <w:r>
@@ -2514,19 +2672,19 @@
         <w:tblW w:w="0" w:type="auto"/>
         <w:tblInd w:w="108" w:type="dxa"/>
         <w:tblBorders>
-          <w:top w:val="single" w:sz="4" w:space="0" w:color="auto"/>
-          <w:left w:val="single" w:sz="4" w:space="0" w:color="auto"/>
-          <w:bottom w:val="single" w:sz="4" w:space="0" w:color="auto"/>
-          <w:right w:val="single" w:sz="4" w:space="0" w:color="auto"/>
-          <w:insideH w:val="single" w:sz="4" w:space="0" w:color="auto"/>
-          <w:insideV w:val="single" w:sz="4" w:space="0" w:color="auto"/>
+          <w:top w:val="single" w:sz="12" w:space="0" w:color="385D65"/>
+          <w:left w:val="single" w:sz="12" w:space="0" w:color="385D65"/>
+          <w:bottom w:val="single" w:sz="12" w:space="0" w:color="385D65"/>
+          <w:right w:val="single" w:sz="12" w:space="0" w:color="385D65"/>
+          <w:insideH w:val="single" w:sz="12" w:space="0" w:color="385D65"/>
+          <w:insideV w:val="single" w:sz="12" w:space="0" w:color="385D65"/>
         </w:tblBorders>
         <w:tblLook w:val="04A0" w:firstRow="1" w:lastRow="0" w:firstColumn="1" w:lastColumn="0" w:noHBand="0" w:noVBand="1"/>
       </w:tblPr>
       <w:tblGrid>
-        <w:gridCol w:w="1777"/>
-        <w:gridCol w:w="1440"/>
-        <w:gridCol w:w="6745"/>
+        <w:gridCol w:w="1773"/>
+        <w:gridCol w:w="1438"/>
+        <w:gridCol w:w="6731"/>
       </w:tblGrid>
       <w:tr>
         <w:trPr>
@@ -2535,12 +2693,12 @@
         <w:tc>
           <w:tcPr>
             <w:cnfStyle w:val="001000000100" w:firstRow="0" w:lastRow="0" w:firstColumn="1" w:lastColumn="0" w:oddVBand="0" w:evenVBand="0" w:oddHBand="0" w:evenHBand="0" w:firstRowFirstColumn="1" w:firstRowLastColumn="0" w:lastRowFirstColumn="0" w:lastRowLastColumn="0"/>
-            <w:tcW w:w="1777" w:type="dxa"/>
+            <w:tcW w:w="1773" w:type="dxa"/>
             <w:tcBorders>
-              <w:top w:val="single" w:sz="24" w:space="0" w:color="508590" w:themeColor="accent6"/>
-              <w:bottom w:val="single" w:sz="24" w:space="0" w:color="508590" w:themeColor="accent6"/>
+              <w:bottom w:val="none" w:sz="0" w:space="0" w:color="auto"/>
+              <w:right w:val="none" w:sz="0" w:space="0" w:color="auto"/>
             </w:tcBorders>
-            <w:shd w:val="clear" w:color="auto" w:fill="auto"/>
+            <w:shd w:val="clear" w:color="auto" w:fill="385D65"/>
           </w:tcPr>
           <w:p>
             <w:pPr>
@@ -2549,26 +2707,16 @@
                 <w:tab w:val="left" w:pos="405"/>
                 <w:tab w:val="center" w:pos="2663"/>
               </w:tabs>
-              <w:rPr>
-                <w:color w:val="auto"/>
-              </w:rPr>
             </w:pPr>
             <w:r>
-              <w:rPr>
-                <w:color w:val="auto"/>
-              </w:rPr>
               <w:t>Dates</w:t>
             </w:r>
           </w:p>
         </w:tc>
         <w:tc>
           <w:tcPr>
-            <w:tcW w:w="1440" w:type="dxa"/>
-            <w:tcBorders>
-              <w:top w:val="single" w:sz="24" w:space="0" w:color="508590" w:themeColor="accent6"/>
-              <w:bottom w:val="single" w:sz="24" w:space="0" w:color="508590" w:themeColor="accent6"/>
-            </w:tcBorders>
-            <w:shd w:val="clear" w:color="auto" w:fill="auto"/>
+            <w:tcW w:w="1438" w:type="dxa"/>
+            <w:shd w:val="clear" w:color="auto" w:fill="385D65"/>
           </w:tcPr>
           <w:p>
             <w:pPr>
@@ -2578,26 +2726,16 @@
                 <w:tab w:val="center" w:pos="2663"/>
               </w:tabs>
               <w:cnfStyle w:val="100000000000" w:firstRow="1" w:lastRow="0" w:firstColumn="0" w:lastColumn="0" w:oddVBand="0" w:evenVBand="0" w:oddHBand="0" w:evenHBand="0" w:firstRowFirstColumn="0" w:firstRowLastColumn="0" w:lastRowFirstColumn="0" w:lastRowLastColumn="0"/>
-              <w:rPr>
-                <w:color w:val="auto"/>
-              </w:rPr>
             </w:pPr>
             <w:r>
-              <w:rPr>
-                <w:color w:val="auto"/>
-              </w:rPr>
               <w:t>Week</w:t>
             </w:r>
           </w:p>
         </w:tc>
         <w:tc>
           <w:tcPr>
-            <w:tcW w:w="6745" w:type="dxa"/>
-            <w:tcBorders>
-              <w:top w:val="single" w:sz="24" w:space="0" w:color="508590" w:themeColor="accent6"/>
-              <w:bottom w:val="single" w:sz="24" w:space="0" w:color="508590" w:themeColor="accent6"/>
-            </w:tcBorders>
-            <w:shd w:val="clear" w:color="auto" w:fill="auto"/>
+            <w:tcW w:w="6731" w:type="dxa"/>
+            <w:shd w:val="clear" w:color="auto" w:fill="385D65"/>
           </w:tcPr>
           <w:p>
             <w:pPr>
@@ -2607,14 +2745,8 @@
                 <w:tab w:val="center" w:pos="2663"/>
               </w:tabs>
               <w:cnfStyle w:val="100000000000" w:firstRow="1" w:lastRow="0" w:firstColumn="0" w:lastColumn="0" w:oddVBand="0" w:evenVBand="0" w:oddHBand="0" w:evenHBand="0" w:firstRowFirstColumn="0" w:firstRowLastColumn="0" w:lastRowFirstColumn="0" w:lastRowLastColumn="0"/>
-              <w:rPr>
-                <w:color w:val="auto"/>
-              </w:rPr>
             </w:pPr>
             <w:r>
-              <w:rPr>
-                <w:color w:val="auto"/>
-              </w:rPr>
               <w:t>Topics</w:t>
             </w:r>
           </w:p>
@@ -2627,9 +2759,11 @@
         <w:tc>
           <w:tcPr>
             <w:cnfStyle w:val="001000000000" w:firstRow="0" w:lastRow="0" w:firstColumn="1" w:lastColumn="0" w:oddVBand="0" w:evenVBand="0" w:oddHBand="0" w:evenHBand="0" w:firstRowFirstColumn="0" w:firstRowLastColumn="0" w:lastRowFirstColumn="0" w:lastRowLastColumn="0"/>
-            <w:tcW w:w="1777" w:type="dxa"/>
+            <w:tcW w:w="1773" w:type="dxa"/>
             <w:tcBorders>
-              <w:top w:val="single" w:sz="24" w:space="0" w:color="508590" w:themeColor="accent6"/>
+              <w:top w:val="none" w:sz="0" w:space="0" w:color="auto"/>
+              <w:bottom w:val="none" w:sz="0" w:space="0" w:color="auto"/>
+              <w:right w:val="none" w:sz="0" w:space="0" w:color="auto"/>
             </w:tcBorders>
             <w:shd w:val="clear" w:color="auto" w:fill="EDF3F4"/>
           </w:tcPr>
@@ -2652,9 +2786,10 @@
         </w:tc>
         <w:tc>
           <w:tcPr>
-            <w:tcW w:w="1440" w:type="dxa"/>
+            <w:tcW w:w="1438" w:type="dxa"/>
             <w:tcBorders>
-              <w:top w:val="single" w:sz="24" w:space="0" w:color="508590" w:themeColor="accent6"/>
+              <w:top w:val="none" w:sz="0" w:space="0" w:color="auto"/>
+              <w:bottom w:val="none" w:sz="0" w:space="0" w:color="auto"/>
             </w:tcBorders>
             <w:shd w:val="clear" w:color="auto" w:fill="EDF3F4"/>
           </w:tcPr>
@@ -2670,9 +2805,10 @@
         </w:tc>
         <w:tc>
           <w:tcPr>
-            <w:tcW w:w="6745" w:type="dxa"/>
+            <w:tcW w:w="6731" w:type="dxa"/>
             <w:tcBorders>
-              <w:top w:val="single" w:sz="24" w:space="0" w:color="508590" w:themeColor="accent6"/>
+              <w:top w:val="none" w:sz="0" w:space="0" w:color="auto"/>
+              <w:bottom w:val="none" w:sz="0" w:space="0" w:color="auto"/>
             </w:tcBorders>
             <w:shd w:val="clear" w:color="auto" w:fill="EDF3F4"/>
           </w:tcPr>
@@ -2682,7 +2818,7 @@
               <w:cnfStyle w:val="000000100000" w:firstRow="0" w:lastRow="0" w:firstColumn="0" w:lastColumn="0" w:oddVBand="0" w:evenVBand="0" w:oddHBand="1" w:evenHBand="0" w:firstRowFirstColumn="0" w:firstRowLastColumn="0" w:lastRowFirstColumn="0" w:lastRowLastColumn="0"/>
             </w:pPr>
             <w:r>
-              <w:t>Introduction to Technical Writing</w:t>
+              <w:t>Exploring Technical Writing Fundamentals</w:t>
             </w:r>
           </w:p>
         </w:tc>
@@ -2691,10 +2827,9 @@
         <w:tc>
           <w:tcPr>
             <w:cnfStyle w:val="001000000000" w:firstRow="0" w:lastRow="0" w:firstColumn="1" w:lastColumn="0" w:oddVBand="0" w:evenVBand="0" w:oddHBand="0" w:evenHBand="0" w:firstRowFirstColumn="0" w:firstRowLastColumn="0" w:lastRowFirstColumn="0" w:lastRowLastColumn="0"/>
-            <w:tcW w:w="1777" w:type="dxa"/>
+            <w:tcW w:w="1773" w:type="dxa"/>
             <w:tcBorders>
-              <w:top w:val="single" w:sz="4" w:space="0" w:color="508590" w:themeColor="accent6"/>
-              <w:bottom w:val="single" w:sz="4" w:space="0" w:color="508590" w:themeColor="accent6"/>
+              <w:right w:val="none" w:sz="0" w:space="0" w:color="auto"/>
             </w:tcBorders>
             <w:shd w:val="clear" w:color="auto" w:fill="auto"/>
           </w:tcPr>
@@ -2717,11 +2852,7 @@
         </w:tc>
         <w:tc>
           <w:tcPr>
-            <w:tcW w:w="1440" w:type="dxa"/>
-            <w:tcBorders>
-              <w:top w:val="single" w:sz="4" w:space="0" w:color="508590" w:themeColor="accent6"/>
-              <w:bottom w:val="single" w:sz="4" w:space="0" w:color="508590" w:themeColor="accent6"/>
-            </w:tcBorders>
+            <w:tcW w:w="1438" w:type="dxa"/>
           </w:tcPr>
           <w:p>
             <w:pPr>
@@ -2735,11 +2866,7 @@
         </w:tc>
         <w:tc>
           <w:tcPr>
-            <w:tcW w:w="6745" w:type="dxa"/>
-            <w:tcBorders>
-              <w:top w:val="single" w:sz="4" w:space="0" w:color="508590" w:themeColor="accent6"/>
-              <w:bottom w:val="single" w:sz="4" w:space="0" w:color="508590" w:themeColor="accent6"/>
-            </w:tcBorders>
+            <w:tcW w:w="6731" w:type="dxa"/>
           </w:tcPr>
           <w:p>
             <w:pPr>
@@ -2747,7 +2874,7 @@
               <w:cnfStyle w:val="000000000000" w:firstRow="0" w:lastRow="0" w:firstColumn="0" w:lastColumn="0" w:oddVBand="0" w:evenVBand="0" w:oddHBand="0" w:evenHBand="0" w:firstRowFirstColumn="0" w:firstRowLastColumn="0" w:lastRowFirstColumn="0" w:lastRowLastColumn="0"/>
             </w:pPr>
             <w:r>
-              <w:t>Correspondence &amp; Workplace Communication</w:t>
+              <w:t>Drafting Correspondence &amp; Informational Reports</w:t>
             </w:r>
           </w:p>
         </w:tc>
@@ -2759,7 +2886,12 @@
         <w:tc>
           <w:tcPr>
             <w:cnfStyle w:val="001000000000" w:firstRow="0" w:lastRow="0" w:firstColumn="1" w:lastColumn="0" w:oddVBand="0" w:evenVBand="0" w:oddHBand="0" w:evenHBand="0" w:firstRowFirstColumn="0" w:firstRowLastColumn="0" w:lastRowFirstColumn="0" w:lastRowLastColumn="0"/>
-            <w:tcW w:w="1777" w:type="dxa"/>
+            <w:tcW w:w="1773" w:type="dxa"/>
+            <w:tcBorders>
+              <w:top w:val="none" w:sz="0" w:space="0" w:color="auto"/>
+              <w:bottom w:val="none" w:sz="0" w:space="0" w:color="auto"/>
+              <w:right w:val="none" w:sz="0" w:space="0" w:color="auto"/>
+            </w:tcBorders>
             <w:shd w:val="clear" w:color="auto" w:fill="EDF3F4"/>
           </w:tcPr>
           <w:p>
@@ -2781,7 +2913,11 @@
         </w:tc>
         <w:tc>
           <w:tcPr>
-            <w:tcW w:w="1440" w:type="dxa"/>
+            <w:tcW w:w="1438" w:type="dxa"/>
+            <w:tcBorders>
+              <w:top w:val="none" w:sz="0" w:space="0" w:color="auto"/>
+              <w:bottom w:val="none" w:sz="0" w:space="0" w:color="auto"/>
+            </w:tcBorders>
             <w:shd w:val="clear" w:color="auto" w:fill="EDF3F4"/>
           </w:tcPr>
           <w:p>
@@ -2796,7 +2932,11 @@
         </w:tc>
         <w:tc>
           <w:tcPr>
-            <w:tcW w:w="6745" w:type="dxa"/>
+            <w:tcW w:w="6731" w:type="dxa"/>
+            <w:tcBorders>
+              <w:top w:val="none" w:sz="0" w:space="0" w:color="auto"/>
+              <w:bottom w:val="none" w:sz="0" w:space="0" w:color="auto"/>
+            </w:tcBorders>
             <w:shd w:val="clear" w:color="auto" w:fill="EDF3F4"/>
           </w:tcPr>
           <w:p>
@@ -2805,7 +2945,7 @@
               <w:cnfStyle w:val="000000100000" w:firstRow="0" w:lastRow="0" w:firstColumn="0" w:lastColumn="0" w:oddVBand="0" w:evenVBand="0" w:oddHBand="1" w:evenHBand="0" w:firstRowFirstColumn="0" w:firstRowLastColumn="0" w:lastRowFirstColumn="0" w:lastRowLastColumn="0"/>
             </w:pPr>
             <w:r>
-              <w:t>Ethics, Style, &amp; Effective Sentences</w:t>
+              <w:t>Applying Ethics &amp; Plain Language</w:t>
             </w:r>
           </w:p>
         </w:tc>
@@ -2814,10 +2954,9 @@
         <w:tc>
           <w:tcPr>
             <w:cnfStyle w:val="001000000000" w:firstRow="0" w:lastRow="0" w:firstColumn="1" w:lastColumn="0" w:oddVBand="0" w:evenVBand="0" w:oddHBand="0" w:evenHBand="0" w:firstRowFirstColumn="0" w:firstRowLastColumn="0" w:lastRowFirstColumn="0" w:lastRowLastColumn="0"/>
-            <w:tcW w:w="1777" w:type="dxa"/>
+            <w:tcW w:w="1773" w:type="dxa"/>
             <w:tcBorders>
-              <w:top w:val="single" w:sz="4" w:space="0" w:color="508590" w:themeColor="accent6"/>
-              <w:bottom w:val="single" w:sz="4" w:space="0" w:color="508590" w:themeColor="accent6"/>
+              <w:right w:val="none" w:sz="0" w:space="0" w:color="auto"/>
             </w:tcBorders>
             <w:shd w:val="clear" w:color="auto" w:fill="auto"/>
           </w:tcPr>
@@ -2840,11 +2979,7 @@
         </w:tc>
         <w:tc>
           <w:tcPr>
-            <w:tcW w:w="1440" w:type="dxa"/>
-            <w:tcBorders>
-              <w:top w:val="single" w:sz="4" w:space="0" w:color="508590" w:themeColor="accent6"/>
-              <w:bottom w:val="single" w:sz="4" w:space="0" w:color="508590" w:themeColor="accent6"/>
-            </w:tcBorders>
+            <w:tcW w:w="1438" w:type="dxa"/>
           </w:tcPr>
           <w:p>
             <w:pPr>
@@ -2858,11 +2993,7 @@
         </w:tc>
         <w:tc>
           <w:tcPr>
-            <w:tcW w:w="6745" w:type="dxa"/>
-            <w:tcBorders>
-              <w:top w:val="single" w:sz="4" w:space="0" w:color="508590" w:themeColor="accent6"/>
-              <w:bottom w:val="single" w:sz="4" w:space="0" w:color="508590" w:themeColor="accent6"/>
-            </w:tcBorders>
+            <w:tcW w:w="6731" w:type="dxa"/>
           </w:tcPr>
           <w:p>
             <w:pPr>
@@ -2870,13 +3001,7 @@
               <w:cnfStyle w:val="000000000000" w:firstRow="0" w:lastRow="0" w:firstColumn="0" w:lastColumn="0" w:oddVBand="0" w:evenVBand="0" w:oddHBand="0" w:evenHBand="0" w:firstRowFirstColumn="0" w:firstRowLastColumn="0" w:lastRowFirstColumn="0" w:lastRowLastColumn="0"/>
             </w:pPr>
             <w:r>
-              <w:t>Research</w:t>
-            </w:r>
-            <w:r>
-              <w:t xml:space="preserve"> &amp; </w:t>
-            </w:r>
-            <w:r>
-              <w:t>Organization</w:t>
+              <w:t>Drafting User Documents &amp; Applying Document Design</w:t>
             </w:r>
           </w:p>
         </w:tc>
@@ -2888,7 +3013,12 @@
         <w:tc>
           <w:tcPr>
             <w:cnfStyle w:val="001000000000" w:firstRow="0" w:lastRow="0" w:firstColumn="1" w:lastColumn="0" w:oddVBand="0" w:evenVBand="0" w:oddHBand="0" w:evenHBand="0" w:firstRowFirstColumn="0" w:firstRowLastColumn="0" w:lastRowFirstColumn="0" w:lastRowLastColumn="0"/>
-            <w:tcW w:w="1777" w:type="dxa"/>
+            <w:tcW w:w="1773" w:type="dxa"/>
+            <w:tcBorders>
+              <w:top w:val="none" w:sz="0" w:space="0" w:color="auto"/>
+              <w:bottom w:val="none" w:sz="0" w:space="0" w:color="auto"/>
+              <w:right w:val="none" w:sz="0" w:space="0" w:color="auto"/>
+            </w:tcBorders>
             <w:shd w:val="clear" w:color="auto" w:fill="EDF3F4"/>
           </w:tcPr>
           <w:p>
@@ -2910,7 +3040,11 @@
         </w:tc>
         <w:tc>
           <w:tcPr>
-            <w:tcW w:w="1440" w:type="dxa"/>
+            <w:tcW w:w="1438" w:type="dxa"/>
+            <w:tcBorders>
+              <w:top w:val="none" w:sz="0" w:space="0" w:color="auto"/>
+              <w:bottom w:val="none" w:sz="0" w:space="0" w:color="auto"/>
+            </w:tcBorders>
             <w:shd w:val="clear" w:color="auto" w:fill="EDF3F4"/>
           </w:tcPr>
           <w:p>
@@ -2925,7 +3059,11 @@
         </w:tc>
         <w:tc>
           <w:tcPr>
-            <w:tcW w:w="6745" w:type="dxa"/>
+            <w:tcW w:w="6731" w:type="dxa"/>
+            <w:tcBorders>
+              <w:top w:val="none" w:sz="0" w:space="0" w:color="auto"/>
+              <w:bottom w:val="none" w:sz="0" w:space="0" w:color="auto"/>
+            </w:tcBorders>
             <w:shd w:val="clear" w:color="auto" w:fill="EDF3F4"/>
           </w:tcPr>
           <w:p>
@@ -2934,10 +3072,7 @@
               <w:cnfStyle w:val="000000100000" w:firstRow="0" w:lastRow="0" w:firstColumn="0" w:lastColumn="0" w:oddVBand="0" w:evenVBand="0" w:oddHBand="1" w:evenHBand="0" w:firstRowFirstColumn="0" w:firstRowLastColumn="0" w:lastRowFirstColumn="0" w:lastRowLastColumn="0"/>
             </w:pPr>
             <w:r>
-              <w:t>Drafting</w:t>
-            </w:r>
-            <w:r>
-              <w:t xml:space="preserve"> the Informational Report</w:t>
+              <w:t>Adding Emphasis &amp; Graphics</w:t>
             </w:r>
           </w:p>
         </w:tc>
@@ -2946,10 +3081,9 @@
         <w:tc>
           <w:tcPr>
             <w:cnfStyle w:val="001000000000" w:firstRow="0" w:lastRow="0" w:firstColumn="1" w:lastColumn="0" w:oddVBand="0" w:evenVBand="0" w:oddHBand="0" w:evenHBand="0" w:firstRowFirstColumn="0" w:firstRowLastColumn="0" w:lastRowFirstColumn="0" w:lastRowLastColumn="0"/>
-            <w:tcW w:w="1777" w:type="dxa"/>
+            <w:tcW w:w="1773" w:type="dxa"/>
             <w:tcBorders>
-              <w:top w:val="single" w:sz="4" w:space="0" w:color="508590" w:themeColor="accent6"/>
-              <w:bottom w:val="single" w:sz="4" w:space="0" w:color="508590" w:themeColor="accent6"/>
+              <w:right w:val="none" w:sz="0" w:space="0" w:color="auto"/>
             </w:tcBorders>
             <w:shd w:val="clear" w:color="auto" w:fill="auto"/>
           </w:tcPr>
@@ -2972,11 +3106,7 @@
         </w:tc>
         <w:tc>
           <w:tcPr>
-            <w:tcW w:w="1440" w:type="dxa"/>
-            <w:tcBorders>
-              <w:top w:val="single" w:sz="4" w:space="0" w:color="508590" w:themeColor="accent6"/>
-              <w:bottom w:val="single" w:sz="4" w:space="0" w:color="508590" w:themeColor="accent6"/>
-            </w:tcBorders>
+            <w:tcW w:w="1438" w:type="dxa"/>
           </w:tcPr>
           <w:p>
             <w:pPr>
@@ -2990,11 +3120,7 @@
         </w:tc>
         <w:tc>
           <w:tcPr>
-            <w:tcW w:w="6745" w:type="dxa"/>
-            <w:tcBorders>
-              <w:top w:val="single" w:sz="4" w:space="0" w:color="508590" w:themeColor="accent6"/>
-              <w:bottom w:val="single" w:sz="4" w:space="0" w:color="508590" w:themeColor="accent6"/>
-            </w:tcBorders>
+            <w:tcW w:w="6731" w:type="dxa"/>
           </w:tcPr>
           <w:p>
             <w:pPr>
@@ -3002,7 +3128,7 @@
               <w:cnfStyle w:val="000000000000" w:firstRow="0" w:lastRow="0" w:firstColumn="0" w:lastColumn="0" w:oddVBand="0" w:evenVBand="0" w:oddHBand="0" w:evenHBand="0" w:firstRowFirstColumn="0" w:firstRowLastColumn="0" w:lastRowFirstColumn="0" w:lastRowLastColumn="0"/>
             </w:pPr>
             <w:r>
-              <w:t>Document Design &amp; Creation of Graphics</w:t>
+              <w:t>Submitting Your User Document</w:t>
             </w:r>
           </w:p>
         </w:tc>
@@ -3015,7 +3141,12 @@
         <w:tc>
           <w:tcPr>
             <w:cnfStyle w:val="001000000000" w:firstRow="0" w:lastRow="0" w:firstColumn="1" w:lastColumn="0" w:oddVBand="0" w:evenVBand="0" w:oddHBand="0" w:evenHBand="0" w:firstRowFirstColumn="0" w:firstRowLastColumn="0" w:lastRowFirstColumn="0" w:lastRowLastColumn="0"/>
-            <w:tcW w:w="1777" w:type="dxa"/>
+            <w:tcW w:w="1773" w:type="dxa"/>
+            <w:tcBorders>
+              <w:top w:val="none" w:sz="0" w:space="0" w:color="auto"/>
+              <w:bottom w:val="none" w:sz="0" w:space="0" w:color="auto"/>
+              <w:right w:val="none" w:sz="0" w:space="0" w:color="auto"/>
+            </w:tcBorders>
             <w:shd w:val="clear" w:color="auto" w:fill="EDF3F4"/>
           </w:tcPr>
           <w:p>
@@ -3037,7 +3168,11 @@
         </w:tc>
         <w:tc>
           <w:tcPr>
-            <w:tcW w:w="1440" w:type="dxa"/>
+            <w:tcW w:w="1438" w:type="dxa"/>
+            <w:tcBorders>
+              <w:top w:val="none" w:sz="0" w:space="0" w:color="auto"/>
+              <w:bottom w:val="none" w:sz="0" w:space="0" w:color="auto"/>
+            </w:tcBorders>
             <w:shd w:val="clear" w:color="auto" w:fill="EDF3F4"/>
           </w:tcPr>
           <w:p>
@@ -3052,7 +3187,11 @@
         </w:tc>
         <w:tc>
           <w:tcPr>
-            <w:tcW w:w="6745" w:type="dxa"/>
+            <w:tcW w:w="6731" w:type="dxa"/>
+            <w:tcBorders>
+              <w:top w:val="none" w:sz="0" w:space="0" w:color="auto"/>
+              <w:bottom w:val="none" w:sz="0" w:space="0" w:color="auto"/>
+            </w:tcBorders>
             <w:shd w:val="clear" w:color="auto" w:fill="EDF3F4"/>
           </w:tcPr>
           <w:p>
@@ -3061,16 +3200,7 @@
               <w:cnfStyle w:val="000000100000" w:firstRow="0" w:lastRow="0" w:firstColumn="0" w:lastColumn="0" w:oddVBand="0" w:evenVBand="0" w:oddHBand="1" w:evenHBand="0" w:firstRowFirstColumn="0" w:firstRowLastColumn="0" w:lastRowFirstColumn="0" w:lastRowLastColumn="0"/>
             </w:pPr>
             <w:r>
-              <w:t xml:space="preserve">Drafting </w:t>
-            </w:r>
-            <w:r>
-              <w:t>User Documents</w:t>
-            </w:r>
-            <w:r>
-              <w:t xml:space="preserve"> &amp; </w:t>
-            </w:r>
-            <w:r>
-              <w:t>User Testing</w:t>
+              <w:t>Drafting Proposals</w:t>
             </w:r>
           </w:p>
         </w:tc>
@@ -3082,7 +3212,10 @@
         <w:tc>
           <w:tcPr>
             <w:cnfStyle w:val="001000000000" w:firstRow="0" w:lastRow="0" w:firstColumn="1" w:lastColumn="0" w:oddVBand="0" w:evenVBand="0" w:oddHBand="0" w:evenHBand="0" w:firstRowFirstColumn="0" w:firstRowLastColumn="0" w:lastRowFirstColumn="0" w:lastRowLastColumn="0"/>
-            <w:tcW w:w="1777" w:type="dxa"/>
+            <w:tcW w:w="1773" w:type="dxa"/>
+            <w:tcBorders>
+              <w:right w:val="none" w:sz="0" w:space="0" w:color="auto"/>
+            </w:tcBorders>
             <w:shd w:val="clear" w:color="auto" w:fill="auto"/>
           </w:tcPr>
           <w:p>
@@ -3104,7 +3237,7 @@
         </w:tc>
         <w:tc>
           <w:tcPr>
-            <w:tcW w:w="1440" w:type="dxa"/>
+            <w:tcW w:w="1438" w:type="dxa"/>
           </w:tcPr>
           <w:p>
             <w:pPr>
@@ -3118,7 +3251,7 @@
         </w:tc>
         <w:tc>
           <w:tcPr>
-            <w:tcW w:w="6745" w:type="dxa"/>
+            <w:tcW w:w="6731" w:type="dxa"/>
           </w:tcPr>
           <w:p>
             <w:pPr>
@@ -3126,7 +3259,7 @@
               <w:cnfStyle w:val="000000000000" w:firstRow="0" w:lastRow="0" w:firstColumn="0" w:lastColumn="0" w:oddVBand="0" w:evenVBand="0" w:oddHBand="0" w:evenHBand="0" w:firstRowFirstColumn="0" w:firstRowLastColumn="0" w:lastRowFirstColumn="0" w:lastRowLastColumn="0"/>
             </w:pPr>
             <w:r>
-              <w:t>Submitting the User Document</w:t>
+              <w:t>Researching Your Project</w:t>
             </w:r>
           </w:p>
         </w:tc>
@@ -3138,7 +3271,12 @@
         <w:tc>
           <w:tcPr>
             <w:cnfStyle w:val="001000000000" w:firstRow="0" w:lastRow="0" w:firstColumn="1" w:lastColumn="0" w:oddVBand="0" w:evenVBand="0" w:oddHBand="0" w:evenHBand="0" w:firstRowFirstColumn="0" w:firstRowLastColumn="0" w:lastRowFirstColumn="0" w:lastRowLastColumn="0"/>
-            <w:tcW w:w="1777" w:type="dxa"/>
+            <w:tcW w:w="1773" w:type="dxa"/>
+            <w:tcBorders>
+              <w:top w:val="none" w:sz="0" w:space="0" w:color="auto"/>
+              <w:bottom w:val="none" w:sz="0" w:space="0" w:color="auto"/>
+              <w:right w:val="none" w:sz="0" w:space="0" w:color="auto"/>
+            </w:tcBorders>
             <w:shd w:val="clear" w:color="auto" w:fill="EDF3F4"/>
           </w:tcPr>
           <w:p>
@@ -3160,7 +3298,11 @@
         </w:tc>
         <w:tc>
           <w:tcPr>
-            <w:tcW w:w="1440" w:type="dxa"/>
+            <w:tcW w:w="1438" w:type="dxa"/>
+            <w:tcBorders>
+              <w:top w:val="none" w:sz="0" w:space="0" w:color="auto"/>
+              <w:bottom w:val="none" w:sz="0" w:space="0" w:color="auto"/>
+            </w:tcBorders>
             <w:shd w:val="clear" w:color="auto" w:fill="EDF3F4"/>
           </w:tcPr>
           <w:p>
@@ -3175,7 +3317,11 @@
         </w:tc>
         <w:tc>
           <w:tcPr>
-            <w:tcW w:w="6745" w:type="dxa"/>
+            <w:tcW w:w="6731" w:type="dxa"/>
+            <w:tcBorders>
+              <w:top w:val="none" w:sz="0" w:space="0" w:color="auto"/>
+              <w:bottom w:val="none" w:sz="0" w:space="0" w:color="auto"/>
+            </w:tcBorders>
             <w:shd w:val="clear" w:color="auto" w:fill="EDF3F4"/>
           </w:tcPr>
           <w:p>
@@ -3184,7 +3330,7 @@
               <w:cnfStyle w:val="000000100000" w:firstRow="0" w:lastRow="0" w:firstColumn="0" w:lastColumn="0" w:oddVBand="0" w:evenVBand="0" w:oddHBand="1" w:evenHBand="0" w:firstRowFirstColumn="0" w:firstRowLastColumn="0" w:lastRowFirstColumn="0" w:lastRowLastColumn="0"/>
             </w:pPr>
             <w:r>
-              <w:t>Proposals &amp; Persuasion</w:t>
+              <w:t>Submitting Your Proposal</w:t>
             </w:r>
           </w:p>
         </w:tc>
@@ -3193,7 +3339,10 @@
         <w:tc>
           <w:tcPr>
             <w:cnfStyle w:val="001000000000" w:firstRow="0" w:lastRow="0" w:firstColumn="1" w:lastColumn="0" w:oddVBand="0" w:evenVBand="0" w:oddHBand="0" w:evenHBand="0" w:firstRowFirstColumn="0" w:firstRowLastColumn="0" w:lastRowFirstColumn="0" w:lastRowLastColumn="0"/>
-            <w:tcW w:w="1777" w:type="dxa"/>
+            <w:tcW w:w="1773" w:type="dxa"/>
+            <w:tcBorders>
+              <w:right w:val="none" w:sz="0" w:space="0" w:color="auto"/>
+            </w:tcBorders>
             <w:shd w:val="clear" w:color="auto" w:fill="auto"/>
           </w:tcPr>
           <w:p>
@@ -3215,7 +3364,7 @@
         </w:tc>
         <w:tc>
           <w:tcPr>
-            <w:tcW w:w="1440" w:type="dxa"/>
+            <w:tcW w:w="1438" w:type="dxa"/>
           </w:tcPr>
           <w:p>
             <w:pPr>
@@ -3229,7 +3378,7 @@
         </w:tc>
         <w:tc>
           <w:tcPr>
-            <w:tcW w:w="6745" w:type="dxa"/>
+            <w:tcW w:w="6731" w:type="dxa"/>
           </w:tcPr>
           <w:p>
             <w:pPr>
@@ -3237,7 +3386,7 @@
               <w:cnfStyle w:val="000000000000" w:firstRow="0" w:lastRow="0" w:firstColumn="0" w:lastColumn="0" w:oddVBand="0" w:evenVBand="0" w:oddHBand="0" w:evenHBand="0" w:firstRowFirstColumn="0" w:firstRowLastColumn="0" w:lastRowFirstColumn="0" w:lastRowLastColumn="0"/>
             </w:pPr>
             <w:r>
-              <w:t>Drafting the Proposal</w:t>
+              <w:t>Writing Recommendation Reports</w:t>
             </w:r>
           </w:p>
         </w:tc>
@@ -3249,7 +3398,12 @@
         <w:tc>
           <w:tcPr>
             <w:cnfStyle w:val="001000000000" w:firstRow="0" w:lastRow="0" w:firstColumn="1" w:lastColumn="0" w:oddVBand="0" w:evenVBand="0" w:oddHBand="0" w:evenHBand="0" w:firstRowFirstColumn="0" w:firstRowLastColumn="0" w:lastRowFirstColumn="0" w:lastRowLastColumn="0"/>
-            <w:tcW w:w="1777" w:type="dxa"/>
+            <w:tcW w:w="1773" w:type="dxa"/>
+            <w:tcBorders>
+              <w:top w:val="none" w:sz="0" w:space="0" w:color="auto"/>
+              <w:bottom w:val="none" w:sz="0" w:space="0" w:color="auto"/>
+              <w:right w:val="none" w:sz="0" w:space="0" w:color="auto"/>
+            </w:tcBorders>
             <w:shd w:val="clear" w:color="auto" w:fill="EDF3F4"/>
           </w:tcPr>
           <w:p>
@@ -3271,7 +3425,11 @@
         </w:tc>
         <w:tc>
           <w:tcPr>
-            <w:tcW w:w="1440" w:type="dxa"/>
+            <w:tcW w:w="1438" w:type="dxa"/>
+            <w:tcBorders>
+              <w:top w:val="none" w:sz="0" w:space="0" w:color="auto"/>
+              <w:bottom w:val="none" w:sz="0" w:space="0" w:color="auto"/>
+            </w:tcBorders>
             <w:shd w:val="clear" w:color="auto" w:fill="EDF3F4"/>
           </w:tcPr>
           <w:p>
@@ -3286,7 +3444,11 @@
         </w:tc>
         <w:tc>
           <w:tcPr>
-            <w:tcW w:w="6745" w:type="dxa"/>
+            <w:tcW w:w="6731" w:type="dxa"/>
+            <w:tcBorders>
+              <w:top w:val="none" w:sz="0" w:space="0" w:color="auto"/>
+              <w:bottom w:val="none" w:sz="0" w:space="0" w:color="auto"/>
+            </w:tcBorders>
             <w:shd w:val="clear" w:color="auto" w:fill="EDF3F4"/>
           </w:tcPr>
           <w:p>
@@ -3295,10 +3457,7 @@
               <w:cnfStyle w:val="000000100000" w:firstRow="0" w:lastRow="0" w:firstColumn="0" w:lastColumn="0" w:oddVBand="0" w:evenVBand="0" w:oddHBand="1" w:evenHBand="0" w:firstRowFirstColumn="0" w:firstRowLastColumn="0" w:lastRowFirstColumn="0" w:lastRowLastColumn="0"/>
             </w:pPr>
             <w:r>
-              <w:t>Submitting</w:t>
-            </w:r>
-            <w:r>
-              <w:t xml:space="preserve"> the Proposal</w:t>
+              <w:t>Planning Your Report</w:t>
             </w:r>
           </w:p>
         </w:tc>
@@ -3307,7 +3466,10 @@
         <w:tc>
           <w:tcPr>
             <w:cnfStyle w:val="001000000000" w:firstRow="0" w:lastRow="0" w:firstColumn="1" w:lastColumn="0" w:oddVBand="0" w:evenVBand="0" w:oddHBand="0" w:evenHBand="0" w:firstRowFirstColumn="0" w:firstRowLastColumn="0" w:lastRowFirstColumn="0" w:lastRowLastColumn="0"/>
-            <w:tcW w:w="1777" w:type="dxa"/>
+            <w:tcW w:w="1773" w:type="dxa"/>
+            <w:tcBorders>
+              <w:right w:val="none" w:sz="0" w:space="0" w:color="auto"/>
+            </w:tcBorders>
             <w:shd w:val="clear" w:color="auto" w:fill="auto"/>
           </w:tcPr>
           <w:p>
@@ -3329,7 +3491,7 @@
         </w:tc>
         <w:tc>
           <w:tcPr>
-            <w:tcW w:w="1440" w:type="dxa"/>
+            <w:tcW w:w="1438" w:type="dxa"/>
           </w:tcPr>
           <w:p>
             <w:pPr>
@@ -3343,7 +3505,7 @@
         </w:tc>
         <w:tc>
           <w:tcPr>
-            <w:tcW w:w="6745" w:type="dxa"/>
+            <w:tcW w:w="6731" w:type="dxa"/>
           </w:tcPr>
           <w:p>
             <w:pPr>
@@ -3351,10 +3513,7 @@
               <w:cnfStyle w:val="000000000000" w:firstRow="0" w:lastRow="0" w:firstColumn="0" w:lastColumn="0" w:oddVBand="0" w:evenVBand="0" w:oddHBand="0" w:evenHBand="0" w:firstRowFirstColumn="0" w:firstRowLastColumn="0" w:lastRowFirstColumn="0" w:lastRowLastColumn="0"/>
             </w:pPr>
             <w:r>
-              <w:t xml:space="preserve">Drafting the </w:t>
-            </w:r>
-            <w:r>
-              <w:t>Recommendation Report Body</w:t>
+              <w:t>Drafting Report’s Body</w:t>
             </w:r>
           </w:p>
         </w:tc>
@@ -3366,7 +3525,12 @@
         <w:tc>
           <w:tcPr>
             <w:cnfStyle w:val="001000000000" w:firstRow="0" w:lastRow="0" w:firstColumn="1" w:lastColumn="0" w:oddVBand="0" w:evenVBand="0" w:oddHBand="0" w:evenHBand="0" w:firstRowFirstColumn="0" w:firstRowLastColumn="0" w:lastRowFirstColumn="0" w:lastRowLastColumn="0"/>
-            <w:tcW w:w="1777" w:type="dxa"/>
+            <w:tcW w:w="1773" w:type="dxa"/>
+            <w:tcBorders>
+              <w:top w:val="none" w:sz="0" w:space="0" w:color="auto"/>
+              <w:bottom w:val="single" w:sz="12" w:space="0" w:color="385D65"/>
+              <w:right w:val="none" w:sz="0" w:space="0" w:color="auto"/>
+            </w:tcBorders>
             <w:shd w:val="clear" w:color="auto" w:fill="EDF3F4"/>
           </w:tcPr>
           <w:p>
@@ -3388,7 +3552,11 @@
         </w:tc>
         <w:tc>
           <w:tcPr>
-            <w:tcW w:w="1440" w:type="dxa"/>
+            <w:tcW w:w="1438" w:type="dxa"/>
+            <w:tcBorders>
+              <w:top w:val="none" w:sz="0" w:space="0" w:color="auto"/>
+              <w:bottom w:val="single" w:sz="12" w:space="0" w:color="385D65"/>
+            </w:tcBorders>
             <w:shd w:val="clear" w:color="auto" w:fill="EDF3F4"/>
           </w:tcPr>
           <w:p>
@@ -3403,7 +3571,11 @@
         </w:tc>
         <w:tc>
           <w:tcPr>
-            <w:tcW w:w="6745" w:type="dxa"/>
+            <w:tcW w:w="6731" w:type="dxa"/>
+            <w:tcBorders>
+              <w:top w:val="none" w:sz="0" w:space="0" w:color="auto"/>
+              <w:bottom w:val="single" w:sz="12" w:space="0" w:color="385D65"/>
+            </w:tcBorders>
             <w:shd w:val="clear" w:color="auto" w:fill="EDF3F4"/>
           </w:tcPr>
           <w:p>
@@ -3412,10 +3584,7 @@
               <w:cnfStyle w:val="000000100000" w:firstRow="0" w:lastRow="0" w:firstColumn="0" w:lastColumn="0" w:oddVBand="0" w:evenVBand="0" w:oddHBand="1" w:evenHBand="0" w:firstRowFirstColumn="0" w:firstRowLastColumn="0" w:lastRowFirstColumn="0" w:lastRowLastColumn="0"/>
             </w:pPr>
             <w:r>
-              <w:t xml:space="preserve">Drafting the </w:t>
-            </w:r>
-            <w:r>
-              <w:t>Report Front &amp; Back Matter</w:t>
+              <w:t>Drafting Report’s Front &amp; Back Matter</w:t>
             </w:r>
           </w:p>
         </w:tc>
@@ -3424,8 +3593,11 @@
         <w:tc>
           <w:tcPr>
             <w:cnfStyle w:val="001000000000" w:firstRow="0" w:lastRow="0" w:firstColumn="1" w:lastColumn="0" w:oddVBand="0" w:evenVBand="0" w:oddHBand="0" w:evenHBand="0" w:firstRowFirstColumn="0" w:firstRowLastColumn="0" w:lastRowFirstColumn="0" w:lastRowLastColumn="0"/>
-            <w:tcW w:w="1777" w:type="dxa"/>
-            <w:shd w:val="clear" w:color="auto" w:fill="F9E3D2" w:themeFill="accent2" w:themeFillTint="33"/>
+            <w:tcW w:w="1773" w:type="dxa"/>
+            <w:tcBorders>
+              <w:right w:val="none" w:sz="0" w:space="0" w:color="auto"/>
+            </w:tcBorders>
+            <w:shd w:val="clear" w:color="auto" w:fill="FCF1E8"/>
           </w:tcPr>
           <w:p>
             <w:pPr>
@@ -3433,61 +3605,51 @@
               <w:rPr>
                 <w:b w:val="0"/>
                 <w:bCs w:val="0"/>
+                <w:color w:val="000000" w:themeColor="text1"/>
               </w:rPr>
             </w:pPr>
             <w:r>
               <w:rPr>
                 <w:b w:val="0"/>
                 <w:bCs w:val="0"/>
+                <w:color w:val="000000" w:themeColor="text1"/>
               </w:rPr>
-              <w:t>Nov 2</w:t>
-            </w:r>
-            <w:r>
-              <w:rPr>
-                <w:b w:val="0"/>
-                <w:bCs w:val="0"/>
-              </w:rPr>
-              <w:t>1</w:t>
-            </w:r>
-            <w:r>
-              <w:rPr>
-                <w:b w:val="0"/>
-                <w:bCs w:val="0"/>
-              </w:rPr>
-              <w:t>–Nov 2</w:t>
-            </w:r>
-            <w:r>
-              <w:rPr>
-                <w:b w:val="0"/>
-                <w:bCs w:val="0"/>
-              </w:rPr>
-              <w:t>9</w:t>
+              <w:t>Nov 21–Nov 29</w:t>
             </w:r>
           </w:p>
         </w:tc>
         <w:tc>
           <w:tcPr>
-            <w:tcW w:w="1440" w:type="dxa"/>
-            <w:shd w:val="clear" w:color="auto" w:fill="F9E3D2" w:themeFill="accent2" w:themeFillTint="33"/>
+            <w:tcW w:w="1438" w:type="dxa"/>
+            <w:shd w:val="clear" w:color="auto" w:fill="FCF1E8"/>
           </w:tcPr>
           <w:p>
             <w:pPr>
               <w:ind w:left="0" w:right="0"/>
               <w:cnfStyle w:val="000000000000" w:firstRow="0" w:lastRow="0" w:firstColumn="0" w:lastColumn="0" w:oddVBand="0" w:evenVBand="0" w:oddHBand="0" w:evenHBand="0" w:firstRowFirstColumn="0" w:firstRowLastColumn="0" w:lastRowFirstColumn="0" w:lastRowLastColumn="0"/>
+              <w:rPr>
+                <w:color w:val="000000" w:themeColor="text1"/>
+              </w:rPr>
             </w:pPr>
           </w:p>
         </w:tc>
         <w:tc>
           <w:tcPr>
-            <w:tcW w:w="6745" w:type="dxa"/>
-            <w:shd w:val="clear" w:color="auto" w:fill="F9E3D2" w:themeFill="accent2" w:themeFillTint="33"/>
+            <w:tcW w:w="6731" w:type="dxa"/>
+            <w:shd w:val="clear" w:color="auto" w:fill="FCF1E8"/>
           </w:tcPr>
           <w:p>
             <w:pPr>
               <w:ind w:left="-59"/>
               <w:cnfStyle w:val="000000000000" w:firstRow="0" w:lastRow="0" w:firstColumn="0" w:lastColumn="0" w:oddVBand="0" w:evenVBand="0" w:oddHBand="0" w:evenHBand="0" w:firstRowFirstColumn="0" w:firstRowLastColumn="0" w:lastRowFirstColumn="0" w:lastRowLastColumn="0"/>
+              <w:rPr>
+                <w:color w:val="000000" w:themeColor="text1"/>
+              </w:rPr>
             </w:pPr>
             <w:r>
+              <w:rPr>
+                <w:color w:val="000000" w:themeColor="text1"/>
+              </w:rPr>
               <w:t>Thanksgiving Break</w:t>
             </w:r>
           </w:p>
@@ -3500,7 +3662,12 @@
         <w:tc>
           <w:tcPr>
             <w:cnfStyle w:val="001000000000" w:firstRow="0" w:lastRow="0" w:firstColumn="1" w:lastColumn="0" w:oddVBand="0" w:evenVBand="0" w:oddHBand="0" w:evenHBand="0" w:firstRowFirstColumn="0" w:firstRowLastColumn="0" w:lastRowFirstColumn="0" w:lastRowLastColumn="0"/>
-            <w:tcW w:w="1777" w:type="dxa"/>
+            <w:tcW w:w="1773" w:type="dxa"/>
+            <w:tcBorders>
+              <w:top w:val="none" w:sz="0" w:space="0" w:color="auto"/>
+              <w:bottom w:val="none" w:sz="0" w:space="0" w:color="auto"/>
+              <w:right w:val="none" w:sz="0" w:space="0" w:color="auto"/>
+            </w:tcBorders>
             <w:shd w:val="clear" w:color="auto" w:fill="EDF3F4"/>
           </w:tcPr>
           <w:p>
@@ -3522,7 +3689,11 @@
         </w:tc>
         <w:tc>
           <w:tcPr>
-            <w:tcW w:w="1440" w:type="dxa"/>
+            <w:tcW w:w="1438" w:type="dxa"/>
+            <w:tcBorders>
+              <w:top w:val="none" w:sz="0" w:space="0" w:color="auto"/>
+              <w:bottom w:val="none" w:sz="0" w:space="0" w:color="auto"/>
+            </w:tcBorders>
             <w:shd w:val="clear" w:color="auto" w:fill="EDF3F4"/>
           </w:tcPr>
           <w:p>
@@ -3531,16 +3702,17 @@
               <w:cnfStyle w:val="000000100000" w:firstRow="0" w:lastRow="0" w:firstColumn="0" w:lastColumn="0" w:oddVBand="0" w:evenVBand="0" w:oddHBand="1" w:evenHBand="0" w:firstRowFirstColumn="0" w:firstRowLastColumn="0" w:lastRowFirstColumn="0" w:lastRowLastColumn="0"/>
             </w:pPr>
             <w:r>
-              <w:t>Week 1</w:t>
-            </w:r>
-            <w:r>
-              <w:t>4</w:t>
+              <w:t>Week 14</w:t>
             </w:r>
           </w:p>
         </w:tc>
         <w:tc>
           <w:tcPr>
-            <w:tcW w:w="6745" w:type="dxa"/>
+            <w:tcW w:w="6731" w:type="dxa"/>
+            <w:tcBorders>
+              <w:top w:val="none" w:sz="0" w:space="0" w:color="auto"/>
+              <w:bottom w:val="none" w:sz="0" w:space="0" w:color="auto"/>
+            </w:tcBorders>
             <w:shd w:val="clear" w:color="auto" w:fill="EDF3F4"/>
           </w:tcPr>
           <w:p>
@@ -3549,10 +3721,7 @@
               <w:cnfStyle w:val="000000100000" w:firstRow="0" w:lastRow="0" w:firstColumn="0" w:lastColumn="0" w:oddVBand="0" w:evenVBand="0" w:oddHBand="1" w:evenHBand="0" w:firstRowFirstColumn="0" w:firstRowLastColumn="0" w:lastRowFirstColumn="0" w:lastRowLastColumn="0"/>
             </w:pPr>
             <w:r>
-              <w:t>Submitting Your Recommendation</w:t>
-            </w:r>
-            <w:r>
-              <w:t xml:space="preserve"> Report</w:t>
+              <w:t>Submitting Your Recommendation Report</w:t>
             </w:r>
           </w:p>
         </w:tc>
@@ -3561,10 +3730,9 @@
         <w:tc>
           <w:tcPr>
             <w:cnfStyle w:val="001000000000" w:firstRow="0" w:lastRow="0" w:firstColumn="1" w:lastColumn="0" w:oddVBand="0" w:evenVBand="0" w:oddHBand="0" w:evenHBand="0" w:firstRowFirstColumn="0" w:firstRowLastColumn="0" w:lastRowFirstColumn="0" w:lastRowLastColumn="0"/>
-            <w:tcW w:w="1777" w:type="dxa"/>
+            <w:tcW w:w="1773" w:type="dxa"/>
             <w:tcBorders>
-              <w:top w:val="single" w:sz="4" w:space="0" w:color="508590" w:themeColor="accent6"/>
-              <w:bottom w:val="single" w:sz="4" w:space="0" w:color="508590" w:themeColor="accent6"/>
+              <w:right w:val="none" w:sz="0" w:space="0" w:color="auto"/>
             </w:tcBorders>
             <w:shd w:val="clear" w:color="auto" w:fill="auto"/>
           </w:tcPr>
@@ -3581,24 +3749,13 @@
                 <w:b w:val="0"/>
                 <w:bCs w:val="0"/>
               </w:rPr>
-              <w:t xml:space="preserve">Dec 7–Dec </w:t>
-            </w:r>
-            <w:r>
-              <w:rPr>
-                <w:b w:val="0"/>
-                <w:bCs w:val="0"/>
-              </w:rPr>
-              <w:t>9</w:t>
+              <w:t>Dec 7–Dec 9</w:t>
             </w:r>
           </w:p>
         </w:tc>
         <w:tc>
           <w:tcPr>
-            <w:tcW w:w="1440" w:type="dxa"/>
-            <w:tcBorders>
-              <w:top w:val="single" w:sz="4" w:space="0" w:color="508590" w:themeColor="accent6"/>
-              <w:bottom w:val="single" w:sz="4" w:space="0" w:color="508590" w:themeColor="accent6"/>
-            </w:tcBorders>
+            <w:tcW w:w="1438" w:type="dxa"/>
           </w:tcPr>
           <w:p>
             <w:pPr>
@@ -3606,20 +3763,13 @@
               <w:cnfStyle w:val="000000000000" w:firstRow="0" w:lastRow="0" w:firstColumn="0" w:lastColumn="0" w:oddVBand="0" w:evenVBand="0" w:oddHBand="0" w:evenHBand="0" w:firstRowFirstColumn="0" w:firstRowLastColumn="0" w:lastRowFirstColumn="0" w:lastRowLastColumn="0"/>
             </w:pPr>
             <w:r>
-              <w:t>Week 1</w:t>
-            </w:r>
-            <w:r>
-              <w:t>5</w:t>
+              <w:t>Week 15</w:t>
             </w:r>
           </w:p>
         </w:tc>
         <w:tc>
           <w:tcPr>
-            <w:tcW w:w="6745" w:type="dxa"/>
-            <w:tcBorders>
-              <w:top w:val="single" w:sz="4" w:space="0" w:color="508590" w:themeColor="accent6"/>
-              <w:bottom w:val="single" w:sz="4" w:space="0" w:color="508590" w:themeColor="accent6"/>
-            </w:tcBorders>
+            <w:tcW w:w="6731" w:type="dxa"/>
           </w:tcPr>
           <w:p>
             <w:pPr>
@@ -3627,7 +3777,7 @@
               <w:cnfStyle w:val="000000000000" w:firstRow="0" w:lastRow="0" w:firstColumn="0" w:lastColumn="0" w:oddVBand="0" w:evenVBand="0" w:oddHBand="0" w:evenHBand="0" w:firstRowFirstColumn="0" w:firstRowLastColumn="0" w:lastRowFirstColumn="0" w:lastRowLastColumn="0"/>
             </w:pPr>
             <w:r>
-              <w:t>Final Thoughts</w:t>
+              <w:t>Finishing the Course</w:t>
             </w:r>
           </w:p>
         </w:tc>
@@ -3639,7 +3789,12 @@
         <w:tc>
           <w:tcPr>
             <w:cnfStyle w:val="001000000000" w:firstRow="0" w:lastRow="0" w:firstColumn="1" w:lastColumn="0" w:oddVBand="0" w:evenVBand="0" w:oddHBand="0" w:evenHBand="0" w:firstRowFirstColumn="0" w:firstRowLastColumn="0" w:lastRowFirstColumn="0" w:lastRowLastColumn="0"/>
-            <w:tcW w:w="1777" w:type="dxa"/>
+            <w:tcW w:w="1773" w:type="dxa"/>
+            <w:tcBorders>
+              <w:top w:val="none" w:sz="0" w:space="0" w:color="auto"/>
+              <w:bottom w:val="none" w:sz="0" w:space="0" w:color="auto"/>
+              <w:right w:val="none" w:sz="0" w:space="0" w:color="auto"/>
+            </w:tcBorders>
             <w:shd w:val="clear" w:color="auto" w:fill="EDF3F4"/>
           </w:tcPr>
           <w:p>
@@ -3655,27 +3810,17 @@
                 <w:b w:val="0"/>
                 <w:bCs w:val="0"/>
               </w:rPr>
-              <w:t xml:space="preserve">Dec </w:t>
-            </w:r>
-            <w:r>
-              <w:rPr>
-                <w:b w:val="0"/>
-                <w:bCs w:val="0"/>
-              </w:rPr>
-              <w:t>11</w:t>
-            </w:r>
-            <w:r>
-              <w:rPr>
-                <w:b w:val="0"/>
-                <w:bCs w:val="0"/>
-              </w:rPr>
-              <w:t>–Dec 16</w:t>
+              <w:t>Dec 11–Dec 16</w:t>
             </w:r>
           </w:p>
         </w:tc>
         <w:tc>
           <w:tcPr>
-            <w:tcW w:w="1440" w:type="dxa"/>
+            <w:tcW w:w="1438" w:type="dxa"/>
+            <w:tcBorders>
+              <w:top w:val="none" w:sz="0" w:space="0" w:color="auto"/>
+              <w:bottom w:val="none" w:sz="0" w:space="0" w:color="auto"/>
+            </w:tcBorders>
             <w:shd w:val="clear" w:color="auto" w:fill="EDF3F4"/>
           </w:tcPr>
           <w:p>
@@ -3690,7 +3835,11 @@
         </w:tc>
         <w:tc>
           <w:tcPr>
-            <w:tcW w:w="6745" w:type="dxa"/>
+            <w:tcW w:w="6731" w:type="dxa"/>
+            <w:tcBorders>
+              <w:top w:val="none" w:sz="0" w:space="0" w:color="auto"/>
+              <w:bottom w:val="none" w:sz="0" w:space="0" w:color="auto"/>
+            </w:tcBorders>
             <w:shd w:val="clear" w:color="auto" w:fill="EDF3F4"/>
           </w:tcPr>
           <w:p>
@@ -3699,16 +3848,7 @@
               <w:cnfStyle w:val="000000100000" w:firstRow="0" w:lastRow="0" w:firstColumn="0" w:lastColumn="0" w:oddVBand="0" w:evenVBand="0" w:oddHBand="1" w:evenHBand="0" w:firstRowFirstColumn="0" w:firstRowLastColumn="0" w:lastRowFirstColumn="0" w:lastRowLastColumn="0"/>
             </w:pPr>
             <w:r>
-              <w:t>Optional Final due by 11:59</w:t>
-            </w:r>
-            <w:r>
-              <w:t xml:space="preserve"> </w:t>
-            </w:r>
-            <w:r>
-              <w:t xml:space="preserve">PM on </w:t>
-            </w:r>
-            <w:r>
-              <w:t>Dec 16</w:t>
+              <w:t>Optional Final due by 11:59 PM on Dec 16</w:t>
             </w:r>
           </w:p>
         </w:tc>
@@ -3720,6 +3860,10 @@
           <w:bottom w:val="single" w:sz="24" w:space="1" w:color="508590" w:themeColor="accent6"/>
         </w:pBdr>
         <w:ind w:left="0" w:right="0"/>
+        <w:rPr>
+          <w:sz w:val="2"/>
+          <w:szCs w:val="2"/>
+        </w:rPr>
         <w:sectPr>
           <w:type w:val="continuous"/>
           <w:pgSz w:w="12240" w:h="15840"/>
@@ -3893,7 +4037,7 @@
                     <pic:cNvPicPr/>
                   </pic:nvPicPr>
                   <pic:blipFill>
-                    <a:blip r:embed="rId21" cstate="print">
+                    <a:blip r:embed="rId22" cstate="print">
                       <a:extLst>
                         <a:ext uri="{28A0092B-C50C-407E-A947-70E740481C1C}">
                           <a14:useLocalDpi xmlns:a14="http://schemas.microsoft.com/office/drawing/2010/main" val="0"/>
@@ -4064,13 +4208,19 @@
         <w:t>two categories (Homework and Major Projects), arranged in six weighted categories, as</w:t>
       </w:r>
       <w:r>
-        <w:t xml:space="preserve"> shown in </w:t>
-      </w:r>
-      <w:r>
-        <w:t>Figure 1,</w:t>
-      </w:r>
-      <w:r>
-        <w:t xml:space="preserve"> on the right.</w:t>
+        <w:t xml:space="preserve"> shown</w:t>
+      </w:r>
+      <w:r>
+        <w:t xml:space="preserve"> below</w:t>
+      </w:r>
+      <w:r>
+        <w:t xml:space="preserve"> in </w:t>
+      </w:r>
+      <w:r>
+        <w:t>Figure 1</w:t>
+      </w:r>
+      <w:r>
+        <w:t>.</w:t>
       </w:r>
     </w:p>
     <w:p>
@@ -4086,28 +4236,30 @@
       <w:r>
         <w:rPr>
           <w:noProof/>
+          <w:sz w:val="32"/>
+          <w:szCs w:val="32"/>
         </w:rPr>
         <w:drawing>
-          <wp:anchor distT="0" distB="0" distL="114300" distR="114300" simplePos="0" relativeHeight="251688960" behindDoc="1" locked="0" layoutInCell="1" allowOverlap="1" wp14:anchorId="4B271854" wp14:editId="5B87579B">
+          <wp:anchor distT="0" distB="0" distL="114300" distR="114300" simplePos="0" relativeHeight="251693056" behindDoc="1" locked="0" layoutInCell="1" allowOverlap="1" wp14:anchorId="1E16486F" wp14:editId="465A8ECE">
             <wp:simplePos x="0" y="0"/>
             <wp:positionH relativeFrom="column">
-              <wp:posOffset>2575560</wp:posOffset>
+              <wp:posOffset>2476500</wp:posOffset>
             </wp:positionH>
             <wp:positionV relativeFrom="paragraph">
-              <wp:posOffset>77470</wp:posOffset>
+              <wp:posOffset>86360</wp:posOffset>
             </wp:positionV>
-            <wp:extent cx="3620770" cy="1943100"/>
-            <wp:effectExtent l="0" t="0" r="0" b="0"/>
+            <wp:extent cx="3877945" cy="2070100"/>
+            <wp:effectExtent l="0" t="0" r="8255" b="6350"/>
             <wp:wrapTight wrapText="bothSides">
               <wp:wrapPolygon edited="0">
                 <wp:start x="0" y="0"/>
-                <wp:lineTo x="0" y="21388"/>
-                <wp:lineTo x="21479" y="21388"/>
-                <wp:lineTo x="21479" y="0"/>
+                <wp:lineTo x="0" y="21467"/>
+                <wp:lineTo x="21540" y="21467"/>
+                <wp:lineTo x="21540" y="0"/>
                 <wp:lineTo x="0" y="0"/>
               </wp:wrapPolygon>
             </wp:wrapTight>
-            <wp:docPr id="1393562450" name="Picture 1"/>
+            <wp:docPr id="1685167853" name="Picture 29"/>
             <wp:cNvGraphicFramePr>
               <a:graphicFrameLocks xmlns:a="http://schemas.openxmlformats.org/drawingml/2006/main" noChangeAspect="1"/>
             </wp:cNvGraphicFramePr>
@@ -4115,29 +4267,38 @@
               <a:graphicData uri="http://schemas.openxmlformats.org/drawingml/2006/picture">
                 <pic:pic xmlns:pic="http://schemas.openxmlformats.org/drawingml/2006/picture">
                   <pic:nvPicPr>
-                    <pic:cNvPr id="1393562450" name=""/>
+                    <pic:cNvPr id="1685167853" name="Picture 1685167853"/>
                     <pic:cNvPicPr/>
                   </pic:nvPicPr>
-                  <pic:blipFill>
-                    <a:blip r:embed="rId22" cstate="print">
+                  <pic:blipFill rotWithShape="1">
+                    <a:blip r:embed="rId23" cstate="print">
                       <a:extLst>
                         <a:ext uri="{28A0092B-C50C-407E-A947-70E740481C1C}">
                           <a14:useLocalDpi xmlns:a14="http://schemas.microsoft.com/office/drawing/2010/main" val="0"/>
                         </a:ext>
                       </a:extLst>
                     </a:blip>
+                    <a:srcRect t="4961" b="23810"/>
                     <a:stretch>
                       <a:fillRect/>
                     </a:stretch>
                   </pic:blipFill>
-                  <pic:spPr>
+                  <pic:spPr bwMode="auto">
                     <a:xfrm>
                       <a:off x="0" y="0"/>
-                      <a:ext cx="3620770" cy="1943100"/>
+                      <a:ext cx="3877945" cy="2070100"/>
                     </a:xfrm>
                     <a:prstGeom prst="rect">
                       <a:avLst/>
                     </a:prstGeom>
+                    <a:ln>
+                      <a:noFill/>
+                    </a:ln>
+                    <a:extLst>
+                      <a:ext uri="{53640926-AAD7-44D8-BBD7-CCE9431645EC}">
+                        <a14:shadowObscured xmlns:a14="http://schemas.microsoft.com/office/drawing/2010/main"/>
+                      </a:ext>
+                    </a:extLst>
                   </pic:spPr>
                 </pic:pic>
               </a:graphicData>
@@ -4151,12 +4312,35 @@
           </wp:anchor>
         </w:drawing>
       </w:r>
+      <w:proofErr w:type="gramStart"/>
       <w:r>
         <w:rPr>
           <w:sz w:val="32"/>
           <w:szCs w:val="32"/>
         </w:rPr>
-        <w:t>Homework (15%)</w:t>
+        <w:t xml:space="preserve">Homework </w:t>
+      </w:r>
+      <w:r>
+        <w:rPr>
+          <w:sz w:val="32"/>
+          <w:szCs w:val="32"/>
+        </w:rPr>
+        <w:t xml:space="preserve"> </w:t>
+      </w:r>
+      <w:r>
+        <w:rPr>
+          <w:sz w:val="32"/>
+          <w:szCs w:val="32"/>
+        </w:rPr>
+        <w:t>(</w:t>
+      </w:r>
+      <w:proofErr w:type="gramEnd"/>
+      <w:r>
+        <w:rPr>
+          <w:sz w:val="32"/>
+          <w:szCs w:val="32"/>
+        </w:rPr>
+        <w:t>15%)</w:t>
       </w:r>
     </w:p>
     <w:p>
@@ -4180,7 +4364,7 @@
         <w:t xml:space="preserve">work in a campus-based class. </w:t>
       </w:r>
       <w:r>
-        <w:t xml:space="preserve">The activities include all of the following: </w:t>
+        <w:t>The activities include all of the following:</w:t>
       </w:r>
     </w:p>
     <w:p>
@@ -4235,13 +4419,13 @@
         <mc:AlternateContent>
           <mc:Choice Requires="wps">
             <w:drawing>
-              <wp:anchor distT="0" distB="0" distL="114300" distR="114300" simplePos="0" relativeHeight="251673600" behindDoc="1" locked="0" layoutInCell="1" allowOverlap="1" wp14:anchorId="7ADBD669" wp14:editId="67E0DE7F">
+              <wp:anchor distT="0" distB="0" distL="114300" distR="114300" simplePos="0" relativeHeight="251673600" behindDoc="1" locked="0" layoutInCell="1" allowOverlap="1" wp14:anchorId="7ADBD669" wp14:editId="53227D2A">
                 <wp:simplePos x="0" y="0"/>
                 <wp:positionH relativeFrom="column">
-                  <wp:posOffset>3039110</wp:posOffset>
+                  <wp:posOffset>2981960</wp:posOffset>
                 </wp:positionH>
                 <wp:positionV relativeFrom="paragraph">
-                  <wp:posOffset>128270</wp:posOffset>
+                  <wp:posOffset>216535</wp:posOffset>
                 </wp:positionV>
                 <wp:extent cx="2881630" cy="635"/>
                 <wp:effectExtent l="0" t="0" r="0" b="6985"/>
@@ -4376,7 +4560,7 @@
                 <v:stroke joinstyle="miter"/>
                 <v:path gradientshapeok="t" o:connecttype="rect"/>
               </v:shapetype>
-              <v:shape id="Text Box 1" o:spid="_x0000_s1026" type="#_x0000_t202" style="position:absolute;left:0;text-align:left;margin-left:239.3pt;margin-top:10.1pt;width:226.9pt;height:.05pt;z-index:-251642880;visibility:visible;mso-wrap-style:square;mso-wrap-distance-left:9pt;mso-wrap-distance-top:0;mso-wrap-distance-right:9pt;mso-wrap-distance-bottom:0;mso-position-horizontal:absolute;mso-position-horizontal-relative:text;mso-position-vertical:absolute;mso-position-vertical-relative:text;v-text-anchor:top" o:gfxdata="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" stroked="f">
+              <v:shape id="Text Box 1" o:spid="_x0000_s1026" type="#_x0000_t202" style="position:absolute;left:0;text-align:left;margin-left:234.8pt;margin-top:17.05pt;width:226.9pt;height:.05pt;z-index:-251642880;visibility:visible;mso-wrap-style:square;mso-wrap-distance-left:9pt;mso-wrap-distance-top:0;mso-wrap-distance-right:9pt;mso-wrap-distance-bottom:0;mso-position-horizontal:absolute;mso-position-horizontal-relative:text;mso-position-vertical:absolute;mso-position-vertical-relative:text;v-text-anchor:top" o:gfxdata="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" stroked="f">
                 <v:textbox style="mso-fit-shape-to-text:t" inset="0,0,0,0">
                   <w:txbxContent>
                     <w:p>
@@ -4548,10 +4732,19 @@
         <w:t>Correspondence</w:t>
       </w:r>
       <w:r>
+        <w:t xml:space="preserve"> &amp; </w:t>
+      </w:r>
+      <w:r>
+        <w:t>Short Informational Report</w:t>
+      </w:r>
+      <w:r>
         <w:t xml:space="preserve"> (</w:t>
       </w:r>
       <w:r>
-        <w:t>10</w:t>
+        <w:t>1</w:t>
+      </w:r>
+      <w:r>
+        <w:t>5</w:t>
       </w:r>
       <w:r>
         <w:t>%)</w:t>
@@ -4566,16 +4759,7 @@
         </w:numPr>
       </w:pPr>
       <w:r>
-        <w:t>Short Informational Report &amp; Annotated Bibliography</w:t>
-      </w:r>
-      <w:r>
-        <w:t xml:space="preserve"> (</w:t>
-      </w:r>
-      <w:r>
-        <w:t>15</w:t>
-      </w:r>
-      <w:r>
-        <w:t>%)</w:t>
+        <w:t>User Document (15%)</w:t>
       </w:r>
     </w:p>
     <w:p>
@@ -4587,7 +4771,19 @@
         </w:numPr>
       </w:pPr>
       <w:r>
-        <w:t>User Document (15%)</w:t>
+        <w:t xml:space="preserve">Proposal </w:t>
+      </w:r>
+      <w:r>
+        <w:t xml:space="preserve">&amp; Annotated Bibliography </w:t>
+      </w:r>
+      <w:r>
+        <w:t>(2</w:t>
+      </w:r>
+      <w:r>
+        <w:t>5</w:t>
+      </w:r>
+      <w:r>
+        <w:t>%)</w:t>
       </w:r>
     </w:p>
     <w:p>
@@ -4599,7 +4795,7 @@
         </w:numPr>
       </w:pPr>
       <w:r>
-        <w:t>Proposal (20%)</w:t>
+        <w:t>Recommendation Report Outline (5%)</w:t>
       </w:r>
     </w:p>
     <w:p>
@@ -4616,6 +4812,12 @@
       <w:r>
         <w:t xml:space="preserve"> Report (25%)</w:t>
       </w:r>
+    </w:p>
+    <w:p>
+      <w:pPr>
+        <w:pStyle w:val="ListParagraph"/>
+        <w:ind w:left="810"/>
+      </w:pPr>
     </w:p>
     <w:p>
       <w:pPr>
@@ -4683,7 +4885,7 @@
                     <pic:cNvPicPr/>
                   </pic:nvPicPr>
                   <pic:blipFill>
-                    <a:blip r:embed="rId23" cstate="print">
+                    <a:blip r:embed="rId24" cstate="print">
                       <a:extLst>
                         <a:ext uri="{28A0092B-C50C-407E-A947-70E740481C1C}">
                           <a14:useLocalDpi xmlns:a14="http://schemas.microsoft.com/office/drawing/2010/main" val="0"/>
@@ -4790,21 +4992,25 @@
         <w:t xml:space="preserve"> </w:t>
       </w:r>
       <w:r>
-        <w:t xml:space="preserve">a 92% </w:t>
-      </w:r>
-      <w:proofErr w:type="gramStart"/>
-      <w:r>
-        <w:t>on</w:t>
-      </w:r>
-      <w:proofErr w:type="gramEnd"/>
-      <w:r>
-        <w:t xml:space="preserve"> a</w:t>
+        <w:t>9</w:t>
+      </w:r>
+      <w:r>
+        <w:t>0</w:t>
+      </w:r>
+      <w:r>
+        <w:t>% on a</w:t>
       </w:r>
       <w:r>
         <w:t xml:space="preserve"> report </w:t>
       </w:r>
       <w:r>
-        <w:t xml:space="preserve">or a B+ on a proposal. </w:t>
+        <w:t xml:space="preserve">or </w:t>
+      </w:r>
+      <w:r>
+        <w:t>a</w:t>
+      </w:r>
+      <w:r>
+        <w:t xml:space="preserve"> B+ on a proposal. </w:t>
       </w:r>
       <w:r>
         <w:t>You’re expected to do the job fully and meet the standard</w:t>
@@ -4892,7 +5098,7 @@
         <w:rPr>
           <w:spacing w:val="-4"/>
         </w:rPr>
-        <w:t xml:space="preserve"> too.</w:t>
+        <w:t>.</w:t>
       </w:r>
       <w:r>
         <w:rPr>
@@ -5056,7 +5262,13 @@
         </w:numPr>
       </w:pPr>
       <w:r>
-        <w:t>Be fully available in Canvas before the Grace Period ends.</w:t>
+        <w:t xml:space="preserve">Be fully </w:t>
+      </w:r>
+      <w:r>
+        <w:t>available</w:t>
+      </w:r>
+      <w:r>
+        <w:t xml:space="preserve"> in Canvas before the Grace Period ends.</w:t>
       </w:r>
     </w:p>
     <w:p>
@@ -5115,16 +5327,25 @@
         <w:ind w:left="187"/>
       </w:pPr>
       <w:r>
-        <w:t xml:space="preserve">Grades are calculated in the project’s rubric. </w:t>
-      </w:r>
-      <w:r>
-        <w:t xml:space="preserve">To find specific expectations, check the assignment and rubric for </w:t>
-      </w:r>
-      <w:r>
-        <w:t>the</w:t>
-      </w:r>
-      <w:r>
-        <w:t xml:space="preserve"> Major Project in Canvas.</w:t>
+        <w:t xml:space="preserve">Each project has a rubric, which </w:t>
+      </w:r>
+      <w:r>
+        <w:t>calculate</w:t>
+      </w:r>
+      <w:r>
+        <w:t>s the grade for the project</w:t>
+      </w:r>
+      <w:r>
+        <w:t xml:space="preserve">. </w:t>
+      </w:r>
+      <w:r>
+        <w:t>To find expectations</w:t>
+      </w:r>
+      <w:r>
+        <w:t xml:space="preserve"> for each project</w:t>
+      </w:r>
+      <w:r>
+        <w:t>, check the assignment and rubric in Canvas.</w:t>
       </w:r>
     </w:p>
     <w:p>
@@ -5167,41 +5388,25 @@
         <w:ind w:left="180"/>
       </w:pPr>
       <w:r>
-        <w:rPr>
-          <w:highlight w:val="yellow"/>
-        </w:rPr>
         <w:t xml:space="preserve">If your work </w:t>
       </w:r>
       <w:r>
-        <w:rPr>
-          <w:highlight w:val="yellow"/>
-        </w:rPr>
-        <w:t>earns any grade</w:t>
+        <w:t>earns a grade</w:t>
       </w:r>
       <w:r>
         <w:rPr>
           <w:b/>
           <w:bCs/>
-          <w:highlight w:val="yellow"/>
         </w:rPr>
         <w:t xml:space="preserve"> lower than an A-</w:t>
       </w:r>
       <w:r>
-        <w:rPr>
-          <w:highlight w:val="yellow"/>
-        </w:rPr>
         <w:t xml:space="preserve">, don’t panic—it’s just a sign that </w:t>
       </w:r>
       <w:r>
-        <w:rPr>
-          <w:highlight w:val="yellow"/>
-        </w:rPr>
         <w:t xml:space="preserve">your project </w:t>
       </w:r>
       <w:r>
-        <w:rPr>
-          <w:highlight w:val="yellow"/>
-        </w:rPr>
         <w:t>needs more work.</w:t>
       </w:r>
     </w:p>
@@ -5229,19 +5434,38 @@
         <w:t>your project</w:t>
       </w:r>
       <w:r>
-        <w:t xml:space="preserve"> until you earn </w:t>
-      </w:r>
-      <w:r>
-        <w:t>an</w:t>
-      </w:r>
-      <w:r>
-        <w:t xml:space="preserve"> A or an A-</w:t>
-      </w:r>
-      <w:r>
         <w:t xml:space="preserve"> </w:t>
       </w:r>
       <w:r>
-        <w:t xml:space="preserve">or </w:t>
+        <w:rPr>
+          <w:b/>
+          <w:bCs/>
+        </w:rPr>
+        <w:t xml:space="preserve">until you earn </w:t>
+      </w:r>
+      <w:r>
+        <w:rPr>
+          <w:b/>
+          <w:bCs/>
+        </w:rPr>
+        <w:t>90 (</w:t>
+      </w:r>
+      <w:r>
+        <w:rPr>
+          <w:b/>
+          <w:bCs/>
+        </w:rPr>
+        <w:t>A-</w:t>
+      </w:r>
+      <w:r>
+        <w:rPr>
+          <w:b/>
+          <w:bCs/>
+        </w:rPr>
+        <w:t>)</w:t>
+      </w:r>
+      <w:r>
+        <w:t xml:space="preserve"> or </w:t>
       </w:r>
       <w:r>
         <w:t xml:space="preserve">until </w:t>
@@ -5255,6 +5479,13 @@
       <w:r>
         <w:t>, whichever comes first.</w:t>
       </w:r>
+      <w:r>
+        <w:rPr>
+          <w:b/>
+          <w:bCs/>
+        </w:rPr>
+        <w:t xml:space="preserve"> Revision grades are capped at 90.</w:t>
+      </w:r>
     </w:p>
     <w:p>
       <w:pPr>
@@ -5265,9 +5496,9 @@
           <w:noProof/>
         </w:rPr>
         <w:drawing>
-          <wp:inline distT="0" distB="0" distL="0" distR="0" wp14:anchorId="28A8442A" wp14:editId="3478778B">
-            <wp:extent cx="3158867" cy="1885950"/>
-            <wp:effectExtent l="38100" t="38100" r="41910" b="38100"/>
+          <wp:inline distT="0" distB="0" distL="0" distR="0" wp14:anchorId="28A8442A" wp14:editId="3387615A">
+            <wp:extent cx="3148965" cy="2095376"/>
+            <wp:effectExtent l="38100" t="38100" r="32385" b="38735"/>
             <wp:docPr id="109" name="Image 109" descr="A person writing on a paper"/>
             <wp:cNvGraphicFramePr/>
             <a:graphic xmlns:a="http://schemas.openxmlformats.org/drawingml/2006/main">
@@ -5277,31 +5508,56 @@
                     <pic:cNvPr id="109" name="Image 109" descr="A person writing on a paper"/>
                     <pic:cNvPicPr/>
                   </pic:nvPicPr>
-                  <pic:blipFill>
-                    <a:blip r:embed="rId24" cstate="print">
+                  <pic:blipFill rotWithShape="1">
+                    <a:blip r:embed="rId25" cstate="print">
                       <a:extLst>
                         <a:ext uri="{28A0092B-C50C-407E-A947-70E740481C1C}">
                           <a14:useLocalDpi xmlns:a14="http://schemas.microsoft.com/office/drawing/2010/main" val="0"/>
                         </a:ext>
                       </a:extLst>
                     </a:blip>
+                    <a:srcRect r="10277"/>
                     <a:stretch>
                       <a:fillRect/>
                     </a:stretch>
                   </pic:blipFill>
-                  <pic:spPr>
+                  <pic:spPr bwMode="auto">
                     <a:xfrm>
                       <a:off x="0" y="0"/>
-                      <a:ext cx="3172570" cy="1894131"/>
+                      <a:ext cx="3156133" cy="2100146"/>
                     </a:xfrm>
                     <a:prstGeom prst="rect">
                       <a:avLst/>
                     </a:prstGeom>
-                    <a:ln w="38100">
+                    <a:ln w="38100" cap="flat" cmpd="sng" algn="ctr">
                       <a:solidFill>
                         <a:srgbClr val="508590"/>
                       </a:solidFill>
+                      <a:prstDash val="solid"/>
+                      <a:round/>
+                      <a:headEnd type="none" w="med" len="med"/>
+                      <a:tailEnd type="none" w="med" len="med"/>
+                      <a:extLst>
+                        <a:ext uri="{C807C97D-BFC1-408E-A445-0C87EB9F89A2}">
+                          <ask:lineSketchStyleProps xmlns:ask="http://schemas.microsoft.com/office/drawing/2018/sketchyshapes" sd="0">
+                            <a:custGeom>
+                              <a:avLst/>
+                              <a:gdLst/>
+                              <a:ahLst/>
+                              <a:cxnLst/>
+                              <a:rect l="0" t="0" r="0" b="0"/>
+                              <a:pathLst/>
+                            </a:custGeom>
+                            <ask:type/>
+                          </ask:lineSketchStyleProps>
+                        </a:ext>
+                      </a:extLst>
                     </a:ln>
+                    <a:extLst>
+                      <a:ext uri="{53640926-AAD7-44D8-BBD7-CCE9431645EC}">
+                        <a14:shadowObscured xmlns:a14="http://schemas.microsoft.com/office/drawing/2010/main"/>
+                      </a:ext>
+                    </a:extLst>
                   </pic:spPr>
                 </pic:pic>
               </a:graphicData>
@@ -5608,7 +5864,7 @@
                     <pic:cNvPicPr/>
                   </pic:nvPicPr>
                   <pic:blipFill>
-                    <a:blip r:embed="rId25" cstate="print">
+                    <a:blip r:embed="rId26" cstate="print">
                       <a:extLst>
                         <a:ext uri="{28A0092B-C50C-407E-A947-70E740481C1C}">
                           <a14:useLocalDpi xmlns:a14="http://schemas.microsoft.com/office/drawing/2010/main" val="0"/>
@@ -5676,13 +5932,10 @@
         </w:numPr>
       </w:pPr>
       <w:r>
-        <w:t>R</w:t>
-      </w:r>
-      <w:r>
-        <w:t>espond to the assignment</w:t>
-      </w:r>
-      <w:r>
-        <w:t>.</w:t>
+        <w:t>Submit before</w:t>
+      </w:r>
+      <w:r>
+        <w:t xml:space="preserve"> the grace period ends.</w:t>
       </w:r>
     </w:p>
     <w:p>
@@ -5694,13 +5947,7 @@
         </w:numPr>
       </w:pPr>
       <w:r>
-        <w:t>M</w:t>
-      </w:r>
-      <w:r>
-        <w:t>eet basic requirements</w:t>
-      </w:r>
-      <w:r>
-        <w:t>.</w:t>
+        <w:t>Turn in your work in Canvas.</w:t>
       </w:r>
     </w:p>
     <w:p>
@@ -5712,7 +5959,13 @@
         </w:numPr>
       </w:pPr>
       <w:r>
-        <w:t>Put in a strong effort.</w:t>
+        <w:t>Upload</w:t>
+      </w:r>
+      <w:r>
+        <w:t xml:space="preserve"> a readable document in Canvas</w:t>
+      </w:r>
+      <w:r>
+        <w:t>.</w:t>
       </w:r>
     </w:p>
     <w:p>
@@ -5724,28 +5977,55 @@
         </w:numPr>
       </w:pPr>
       <w:r>
-        <w:t xml:space="preserve">Submit </w:t>
-      </w:r>
-      <w:r>
-        <w:t xml:space="preserve">a readable document </w:t>
-      </w:r>
-      <w:r>
-        <w:t>in Canvas</w:t>
-      </w:r>
-      <w:r>
-        <w:t xml:space="preserve"> </w:t>
-      </w:r>
-      <w:r>
-        <w:t>b</w:t>
-      </w:r>
-      <w:r>
-        <w:t xml:space="preserve">efore </w:t>
-      </w:r>
-      <w:r>
-        <w:t>the grace period</w:t>
-      </w:r>
-      <w:r>
-        <w:t xml:space="preserve"> ends.</w:t>
+        <w:t>M</w:t>
+      </w:r>
+      <w:r>
+        <w:t xml:space="preserve">eet </w:t>
+      </w:r>
+      <w:r>
+        <w:t xml:space="preserve">all </w:t>
+      </w:r>
+      <w:r>
+        <w:t>basic requirements</w:t>
+      </w:r>
+      <w:r>
+        <w:t>.</w:t>
+      </w:r>
+    </w:p>
+    <w:p>
+      <w:pPr>
+        <w:pStyle w:val="BodyText"/>
+        <w:numPr>
+          <w:ilvl w:val="0"/>
+          <w:numId w:val="23"/>
+        </w:numPr>
+      </w:pPr>
+      <w:r>
+        <w:t>R</w:t>
+      </w:r>
+      <w:r>
+        <w:t xml:space="preserve">espond </w:t>
+      </w:r>
+      <w:r>
+        <w:t xml:space="preserve">directly </w:t>
+      </w:r>
+      <w:r>
+        <w:t>to the assignment</w:t>
+      </w:r>
+      <w:r>
+        <w:t>.</w:t>
+      </w:r>
+    </w:p>
+    <w:p>
+      <w:pPr>
+        <w:pStyle w:val="BodyText"/>
+        <w:numPr>
+          <w:ilvl w:val="0"/>
+          <w:numId w:val="23"/>
+        </w:numPr>
+      </w:pPr>
+      <w:r>
+        <w:t>Put in a strong effort.</w:t>
       </w:r>
     </w:p>
     <w:p>
@@ -5780,7 +6060,7 @@
                     <pic:cNvPicPr/>
                   </pic:nvPicPr>
                   <pic:blipFill rotWithShape="1">
-                    <a:blip r:embed="rId26" cstate="print">
+                    <a:blip r:embed="rId27" cstate="print">
                       <a:extLst>
                         <a:ext uri="{28A0092B-C50C-407E-A947-70E740481C1C}">
                           <a14:useLocalDpi xmlns:a14="http://schemas.microsoft.com/office/drawing/2010/main" val="0"/>
@@ -5857,13 +6137,7 @@
         </w:numPr>
       </w:pPr>
       <w:r>
-        <w:t xml:space="preserve">Don’t do </w:t>
-      </w:r>
-      <w:r>
-        <w:t xml:space="preserve">or submit </w:t>
-      </w:r>
-      <w:r>
-        <w:t>the work at all.</w:t>
+        <w:t>Miss the end of the Grace Period.</w:t>
       </w:r>
     </w:p>
     <w:p>
@@ -5875,13 +6149,7 @@
         </w:numPr>
       </w:pPr>
       <w:r>
-        <w:t xml:space="preserve">Don’t </w:t>
-      </w:r>
-      <w:r>
-        <w:t>meet the basic requirements</w:t>
-      </w:r>
-      <w:r>
-        <w:t>.</w:t>
+        <w:t>Don’t submit your work in Canvas.</w:t>
       </w:r>
     </w:p>
     <w:p>
@@ -5893,19 +6161,22 @@
         </w:numPr>
       </w:pPr>
       <w:r>
-        <w:t>D</w:t>
-      </w:r>
-      <w:r>
-        <w:t xml:space="preserve">on’t put in </w:t>
-      </w:r>
-      <w:r>
-        <w:t>your</w:t>
-      </w:r>
-      <w:r>
-        <w:t xml:space="preserve"> full</w:t>
-      </w:r>
-      <w:r>
-        <w:t xml:space="preserve"> effort</w:t>
+        <w:t>Upload</w:t>
+      </w:r>
+      <w:r>
+        <w:t xml:space="preserve"> a</w:t>
+      </w:r>
+      <w:r>
+        <w:t>n</w:t>
+      </w:r>
+      <w:r>
+        <w:t xml:space="preserve"> </w:t>
+      </w:r>
+      <w:r>
+        <w:t>un</w:t>
+      </w:r>
+      <w:r>
+        <w:t>readable document</w:t>
       </w:r>
       <w:r>
         <w:t>.</w:t>
@@ -5920,19 +6191,16 @@
         </w:numPr>
       </w:pPr>
       <w:r>
-        <w:t>Don’t submit a</w:t>
+        <w:t>Fail to</w:t>
       </w:r>
       <w:r>
         <w:t xml:space="preserve"> </w:t>
       </w:r>
       <w:r>
-        <w:t xml:space="preserve">readable </w:t>
-      </w:r>
-      <w:r>
-        <w:t>document</w:t>
-      </w:r>
-      <w:r>
-        <w:t xml:space="preserve"> in Canvas before the Grace Period ends.</w:t>
+        <w:t>meet the basic requirements</w:t>
+      </w:r>
+      <w:r>
+        <w:t>.</w:t>
       </w:r>
     </w:p>
     <w:p>
@@ -5944,19 +6212,43 @@
         </w:numPr>
       </w:pPr>
       <w:r>
+        <w:t>Do work unrelated to the</w:t>
+      </w:r>
+      <w:r>
+        <w:t xml:space="preserve"> </w:t>
+      </w:r>
+      <w:r>
+        <w:t>assignment</w:t>
+      </w:r>
+      <w:r>
+        <w:t>.</w:t>
+      </w:r>
+    </w:p>
+    <w:p>
+      <w:pPr>
+        <w:pStyle w:val="BodyText"/>
+        <w:numPr>
+          <w:ilvl w:val="0"/>
+          <w:numId w:val="22"/>
+        </w:numPr>
+      </w:pPr>
+      <w:r>
         <w:t>D</w:t>
       </w:r>
       <w:r>
-        <w:t xml:space="preserve">o </w:t>
-      </w:r>
-      <w:r>
-        <w:t>work</w:t>
-      </w:r>
-      <w:r>
-        <w:t xml:space="preserve"> unrelated to the </w:t>
-      </w:r>
-      <w:r>
-        <w:t>assigned task.</w:t>
+        <w:t xml:space="preserve">on’t put in </w:t>
+      </w:r>
+      <w:r>
+        <w:t>your</w:t>
+      </w:r>
+      <w:r>
+        <w:t xml:space="preserve"> full</w:t>
+      </w:r>
+      <w:r>
+        <w:t xml:space="preserve"> effort</w:t>
+      </w:r>
+      <w:r>
+        <w:t>.</w:t>
       </w:r>
     </w:p>
     <w:p>
@@ -5991,25 +6283,34 @@
         <w:ind w:left="0" w:right="0"/>
       </w:pPr>
       <w:r>
-        <w:t>Canvas grades your homework automatically</w:t>
-      </w:r>
-      <w:r>
-        <w:t xml:space="preserve"> in </w:t>
-      </w:r>
-      <w:r>
-        <w:t>most</w:t>
-      </w:r>
-      <w:r>
-        <w:t xml:space="preserve"> situation</w:t>
-      </w:r>
-      <w:r>
-        <w:t>s</w:t>
-      </w:r>
-      <w:r>
-        <w:t xml:space="preserve"> (see the table below)</w:t>
-      </w:r>
-      <w:r>
-        <w:t xml:space="preserve">. When the grade is automatic, I spot-check the work to ensure the grade is accurate. If I notice that you shouldn’t have earned credit, I will change the grade and ask you to try again. </w:t>
+        <w:t xml:space="preserve">Canvas grades </w:t>
+      </w:r>
+      <w:r>
+        <w:t xml:space="preserve">most </w:t>
+      </w:r>
+      <w:r>
+        <w:t>homework automatically</w:t>
+      </w:r>
+      <w:r>
+        <w:t xml:space="preserve"> </w:t>
+      </w:r>
+      <w:r>
+        <w:t>(see the table below)</w:t>
+      </w:r>
+      <w:r>
+        <w:t>. When the grade is automatic, I spot-check the work to ensure the grade is accurate. If I notice that you shouldn’t have earned credit, I change the grade</w:t>
+      </w:r>
+      <w:r>
+        <w:t>. If time allows, I may</w:t>
+      </w:r>
+      <w:r>
+        <w:t xml:space="preserve"> ask you to try agai</w:t>
+      </w:r>
+      <w:r>
+        <w:t>n</w:t>
+      </w:r>
+      <w:r>
+        <w:t>.</w:t>
       </w:r>
     </w:p>
     <w:tbl>
@@ -6335,17 +6636,26 @@
         <w:pStyle w:val="Heading2"/>
       </w:pPr>
       <w:r>
+        <w:t>What Happens When You Earn No Credit?</w:t>
+      </w:r>
+    </w:p>
+    <w:p>
+      <w:pPr>
+        <w:spacing w:after="120" w:line="240" w:lineRule="auto"/>
+        <w:ind w:left="0" w:right="0"/>
+      </w:pPr>
+      <w:r>
         <w:rPr>
           <w:noProof/>
         </w:rPr>
         <w:drawing>
-          <wp:anchor distT="0" distB="0" distL="114300" distR="114300" simplePos="0" relativeHeight="251680768" behindDoc="0" locked="0" layoutInCell="1" allowOverlap="1" wp14:anchorId="41E67C0D" wp14:editId="5C70EDEC">
+          <wp:anchor distT="0" distB="0" distL="114300" distR="114300" simplePos="0" relativeHeight="251680768" behindDoc="0" locked="0" layoutInCell="1" allowOverlap="1" wp14:anchorId="41E67C0D" wp14:editId="7BD91FA0">
             <wp:simplePos x="0" y="0"/>
             <wp:positionH relativeFrom="column">
               <wp:posOffset>0</wp:posOffset>
             </wp:positionH>
             <wp:positionV relativeFrom="paragraph">
-              <wp:posOffset>382270</wp:posOffset>
+              <wp:posOffset>17145</wp:posOffset>
             </wp:positionV>
             <wp:extent cx="333375" cy="333375"/>
             <wp:effectExtent l="0" t="0" r="9525" b="9525"/>
@@ -6374,7 +6684,7 @@
                     <pic:cNvPicPr/>
                   </pic:nvPicPr>
                   <pic:blipFill>
-                    <a:blip r:embed="rId27" cstate="print">
+                    <a:blip r:embed="rId28" cstate="print">
                       <a:extLst>
                         <a:ext uri="{28A0092B-C50C-407E-A947-70E740481C1C}">
                           <a14:useLocalDpi xmlns:a14="http://schemas.microsoft.com/office/drawing/2010/main" val="0"/>
@@ -6407,15 +6717,6 @@
         </w:drawing>
       </w:r>
       <w:r>
-        <w:t>What Happens When You Earn No Credit?</w:t>
-      </w:r>
-    </w:p>
-    <w:p>
-      <w:pPr>
-        <w:spacing w:after="120" w:line="240" w:lineRule="auto"/>
-        <w:ind w:left="0" w:right="0"/>
-      </w:pPr>
-      <w:r>
         <w:t>E</w:t>
       </w:r>
       <w:r>
@@ -6452,16 +6753,16 @@
         <mc:AlternateContent>
           <mc:Choice Requires="wps">
             <w:drawing>
-              <wp:anchor distT="0" distB="0" distL="114300" distR="114300" simplePos="0" relativeHeight="251659264" behindDoc="0" locked="0" layoutInCell="1" allowOverlap="1" wp14:anchorId="5681DE53" wp14:editId="10EC76FB">
+              <wp:anchor distT="0" distB="0" distL="114300" distR="114300" simplePos="0" relativeHeight="251659264" behindDoc="0" locked="0" layoutInCell="1" allowOverlap="1" wp14:anchorId="5681DE53" wp14:editId="55DC58FB">
                 <wp:simplePos x="0" y="0"/>
                 <wp:positionH relativeFrom="column">
                   <wp:posOffset>-9525</wp:posOffset>
                 </wp:positionH>
                 <wp:positionV relativeFrom="paragraph">
-                  <wp:posOffset>326390</wp:posOffset>
+                  <wp:posOffset>325120</wp:posOffset>
                 </wp:positionV>
-                <wp:extent cx="6464300" cy="713232"/>
-                <wp:effectExtent l="19050" t="19050" r="12700" b="10795"/>
+                <wp:extent cx="6464300" cy="762000"/>
+                <wp:effectExtent l="19050" t="19050" r="12700" b="19050"/>
                 <wp:wrapNone/>
                 <wp:docPr id="1213043431" name="Rectangle 85">
                   <a:extLst xmlns:a="http://schemas.openxmlformats.org/drawingml/2006/main">
@@ -6478,7 +6779,7 @@
                       <wps:spPr>
                         <a:xfrm>
                           <a:off x="0" y="0"/>
-                          <a:ext cx="6464300" cy="713232"/>
+                          <a:ext cx="6464300" cy="762000"/>
                         </a:xfrm>
                         <a:prstGeom prst="rect">
                           <a:avLst/>
@@ -6526,7 +6827,7 @@
           </mc:Choice>
           <mc:Fallback>
             <w:pict>
-              <v:rect w14:anchorId="0E0C4A2D" id="Rectangle 85" o:spid="_x0000_s1026" alt="&quot;&quot;" style="position:absolute;margin-left:-.75pt;margin-top:25.7pt;width:509pt;height:56.15pt;z-index:251659264;visibility:visible;mso-wrap-style:square;mso-width-percent:0;mso-height-percent:0;mso-wrap-distance-left:9pt;mso-wrap-distance-top:0;mso-wrap-distance-right:9pt;mso-wrap-distance-bottom:0;mso-position-horizontal:absolute;mso-position-horizontal-relative:text;mso-position-vertical:absolute;mso-position-vertical-relative:text;mso-width-percent:0;mso-height-percent:0;mso-width-relative:margin;mso-height-relative:margin;v-text-anchor:middle" o:gfxdata="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" filled="f" strokecolor="#508590" strokeweight="3pt"/>
+              <v:rect w14:anchorId="7FA11276" id="Rectangle 85" o:spid="_x0000_s1026" alt="&quot;&quot;" style="position:absolute;margin-left:-.75pt;margin-top:25.6pt;width:509pt;height:60pt;z-index:251659264;visibility:visible;mso-wrap-style:square;mso-width-percent:0;mso-height-percent:0;mso-wrap-distance-left:9pt;mso-wrap-distance-top:0;mso-wrap-distance-right:9pt;mso-wrap-distance-bottom:0;mso-position-horizontal:absolute;mso-position-horizontal-relative:text;mso-position-vertical:absolute;mso-position-vertical-relative:text;mso-width-percent:0;mso-height-percent:0;mso-width-relative:margin;mso-height-relative:margin;v-text-anchor:middle" o:gfxdata="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" filled="f" strokecolor="#508590" strokeweight="3pt"/>
             </w:pict>
           </mc:Fallback>
         </mc:AlternateContent>
@@ -6754,7 +7055,7 @@
                     <pic:cNvPicPr/>
                   </pic:nvPicPr>
                   <pic:blipFill>
-                    <a:blip r:embed="rId28" cstate="print">
+                    <a:blip r:embed="rId29" cstate="print">
                       <a:extLst>
                         <a:ext uri="{28A0092B-C50C-407E-A947-70E740481C1C}">
                           <a14:useLocalDpi xmlns:a14="http://schemas.microsoft.com/office/drawing/2010/main" val="0"/>
@@ -6960,7 +7261,13 @@
         <w:t>The Grace Period lets you t</w:t>
       </w:r>
       <w:r>
-        <w:t>ake more time when you need it, as often as you need it, and then turn your work in before the grace period ends.</w:t>
+        <w:t>ake more time when you need it, as often as you need it, and then</w:t>
+      </w:r>
+      <w:r>
+        <w:t xml:space="preserve"> </w:t>
+      </w:r>
+      <w:r>
+        <w:t>turn your work in before the grace period ends.</w:t>
       </w:r>
     </w:p>
     <w:p>
@@ -7097,7 +7404,10 @@
         <w:t>Date</w:t>
       </w:r>
       <w:r>
-        <w:t>.</w:t>
+        <w:t xml:space="preserve">, </w:t>
+      </w:r>
+      <w:r>
+        <w:t>the</w:t>
       </w:r>
       <w:r>
         <w:rPr>
@@ -7106,7 +7416,7 @@
         <w:t xml:space="preserve"> </w:t>
       </w:r>
       <w:r>
-        <w:t>That’s</w:t>
+        <w:t>date</w:t>
       </w:r>
       <w:r>
         <w:rPr>
@@ -7115,31 +7425,13 @@
         <w:t xml:space="preserve"> </w:t>
       </w:r>
       <w:r>
-        <w:t>the</w:t>
-      </w:r>
-      <w:r>
-        <w:rPr>
-          <w:spacing w:val="-5"/>
-        </w:rPr>
-        <w:t xml:space="preserve"> </w:t>
-      </w:r>
-      <w:r>
-        <w:t>date</w:t>
-      </w:r>
-      <w:r>
-        <w:rPr>
-          <w:spacing w:val="-5"/>
-        </w:rPr>
-        <w:t xml:space="preserve"> </w:t>
-      </w:r>
-      <w:r>
         <w:t xml:space="preserve">the assignment is due. </w:t>
       </w:r>
       <w:r>
         <w:t xml:space="preserve">Aim for the Target Due Date </w:t>
       </w:r>
       <w:r>
-        <w:t>so you do not fall behind in the course.</w:t>
+        <w:t>so you do not fall behind.</w:t>
       </w:r>
       <w:r>
         <w:t xml:space="preserve"> </w:t>
@@ -7251,7 +7543,19 @@
         <w:t>nds</w:t>
       </w:r>
       <w:r>
-        <w:t xml:space="preserve"> each week </w:t>
+        <w:t xml:space="preserve"> </w:t>
+      </w:r>
+      <w:r>
+        <w:t>most</w:t>
+      </w:r>
+      <w:r>
+        <w:t xml:space="preserve"> week</w:t>
+      </w:r>
+      <w:r>
+        <w:t>s</w:t>
+      </w:r>
+      <w:r>
+        <w:t xml:space="preserve"> </w:t>
       </w:r>
       <w:r>
         <w:t xml:space="preserve">at </w:t>
@@ -7261,21 +7565,17 @@
           <w:b/>
           <w:bCs/>
         </w:rPr>
-        <w:t>11:59 PM on Fridays</w:t>
+        <w:t>11:59 PM on Friday.</w:t>
       </w:r>
       <w:r>
         <w:rPr>
           <w:b/>
           <w:bCs/>
         </w:rPr>
-        <w:t xml:space="preserve"> for most weeks</w:t>
-      </w:r>
-      <w:r>
-        <w:rPr>
-          <w:b/>
-          <w:bCs/>
-        </w:rPr>
-        <w:t>.</w:t>
+        <w:t xml:space="preserve"> </w:t>
+      </w:r>
+      <w:r>
+        <w:t>Exceptions are Fall Break and the week after Thanksgiving Break.</w:t>
       </w:r>
     </w:p>
     <w:p>
@@ -7464,7 +7764,13 @@
       </w:r>
       <w:proofErr w:type="gramEnd"/>
       <w:r>
-        <w:t xml:space="preserve"> following the Target Due Date</w:t>
+        <w:t xml:space="preserve"> following the </w:t>
+      </w:r>
+      <w:r>
+        <w:t xml:space="preserve">relevant </w:t>
+      </w:r>
+      <w:r>
+        <w:t>Target Due Date</w:t>
       </w:r>
       <w:r>
         <w:t>.</w:t>
@@ -7553,7 +7859,7 @@
         <mc:AlternateContent>
           <mc:Choice Requires="wps">
             <w:drawing>
-              <wp:anchor distT="0" distB="0" distL="114300" distR="114300" simplePos="0" relativeHeight="251685888" behindDoc="0" locked="0" layoutInCell="1" allowOverlap="1" wp14:anchorId="68842835" wp14:editId="39D5958F">
+              <wp:anchor distT="0" distB="0" distL="114300" distR="114300" simplePos="0" relativeHeight="251685888" behindDoc="0" locked="0" layoutInCell="1" allowOverlap="1" wp14:anchorId="68842835" wp14:editId="6A991511">
                 <wp:simplePos x="0" y="0"/>
                 <wp:positionH relativeFrom="column">
                   <wp:posOffset>-28575</wp:posOffset>
@@ -7561,8 +7867,8 @@
                 <wp:positionV relativeFrom="paragraph">
                   <wp:posOffset>458470</wp:posOffset>
                 </wp:positionV>
-                <wp:extent cx="6505575" cy="1019175"/>
-                <wp:effectExtent l="19050" t="19050" r="28575" b="28575"/>
+                <wp:extent cx="6505575" cy="1066800"/>
+                <wp:effectExtent l="19050" t="19050" r="28575" b="19050"/>
                 <wp:wrapNone/>
                 <wp:docPr id="579908241" name="Rectangle 26">
                   <a:extLst xmlns:a="http://schemas.openxmlformats.org/drawingml/2006/main">
@@ -7579,7 +7885,7 @@
                       <wps:spPr>
                         <a:xfrm>
                           <a:off x="0" y="0"/>
-                          <a:ext cx="6505575" cy="1019175"/>
+                          <a:ext cx="6505575" cy="1066800"/>
                         </a:xfrm>
                         <a:prstGeom prst="rect">
                           <a:avLst/>
@@ -7618,7 +7924,7 @@
           </mc:Choice>
           <mc:Fallback>
             <w:pict>
-              <v:rect w14:anchorId="1A74C918" id="Rectangle 26" o:spid="_x0000_s1026" alt="&quot;&quot;" style="position:absolute;margin-left:-2.25pt;margin-top:36.1pt;width:512.25pt;height:80.25pt;z-index:251685888;visibility:visible;mso-wrap-style:square;mso-height-percent:0;mso-wrap-distance-left:9pt;mso-wrap-distance-top:0;mso-wrap-distance-right:9pt;mso-wrap-distance-bottom:0;mso-position-horizontal:absolute;mso-position-horizontal-relative:text;mso-position-vertical:absolute;mso-position-vertical-relative:text;mso-height-percent:0;mso-height-relative:margin;v-text-anchor:middle" o:gfxdata="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" filled="f" strokecolor="#508590 [3209]" strokeweight="3pt"/>
+              <v:rect w14:anchorId="16AD7480" id="Rectangle 26" o:spid="_x0000_s1026" alt="&quot;&quot;" style="position:absolute;margin-left:-2.25pt;margin-top:36.1pt;width:512.25pt;height:84pt;z-index:251685888;visibility:visible;mso-wrap-style:square;mso-height-percent:0;mso-wrap-distance-left:9pt;mso-wrap-distance-top:0;mso-wrap-distance-right:9pt;mso-wrap-distance-bottom:0;mso-position-horizontal:absolute;mso-position-horizontal-relative:text;mso-position-vertical:absolute;mso-position-vertical-relative:text;mso-height-percent:0;mso-height-relative:margin;v-text-anchor:middle" o:gfxdata="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" filled="f" strokecolor="#508590 [3209]" strokeweight="3pt"/>
             </w:pict>
           </mc:Fallback>
         </mc:AlternateContent>
@@ -7934,28 +8240,39 @@
         </w:numPr>
         <w:spacing w:after="120"/>
         <w:ind w:right="360"/>
-        <w:rPr>
-          <w:highlight w:val="yellow"/>
-        </w:rPr>
-      </w:pPr>
-      <w:r>
-        <w:rPr>
-          <w:highlight w:val="yellow"/>
-        </w:rPr>
+      </w:pPr>
+      <w:r>
         <w:t xml:space="preserve">You earn </w:t>
       </w:r>
       <w:r>
         <w:rPr>
           <w:b/>
           <w:bCs/>
-          <w:highlight w:val="yellow"/>
-        </w:rPr>
-        <w:t>a grade lower than an A-</w:t>
-      </w:r>
-      <w:r>
-        <w:rPr>
-          <w:highlight w:val="yellow"/>
-        </w:rPr>
+        </w:rPr>
+        <w:t>a grade lower than</w:t>
+      </w:r>
+      <w:r>
+        <w:rPr>
+          <w:b/>
+          <w:bCs/>
+        </w:rPr>
+        <w:t xml:space="preserve"> 90 (</w:t>
+      </w:r>
+      <w:r>
+        <w:rPr>
+          <w:b/>
+          <w:bCs/>
+        </w:rPr>
+        <w:t>A-</w:t>
+      </w:r>
+      <w:r>
+        <w:rPr>
+          <w:b/>
+          <w:bCs/>
+        </w:rPr>
+        <w:t>)</w:t>
+      </w:r>
+      <w:r>
         <w:t xml:space="preserve"> on that Major Project.</w:t>
       </w:r>
     </w:p>
@@ -7984,7 +8301,7 @@
                     <pic:cNvPicPr/>
                   </pic:nvPicPr>
                   <pic:blipFill rotWithShape="1">
-                    <a:blip r:embed="rId29" cstate="print">
+                    <a:blip r:embed="rId30" cstate="print">
                       <a:extLst>
                         <a:ext uri="{28A0092B-C50C-407E-A947-70E740481C1C}">
                           <a14:useLocalDpi xmlns:a14="http://schemas.microsoft.com/office/drawing/2010/main" val="0"/>
@@ -8118,23 +8435,23 @@
         <w:t xml:space="preserve">, </w:t>
       </w:r>
       <w:r>
-        <w:rPr>
-          <w:highlight w:val="yellow"/>
-        </w:rPr>
         <w:t xml:space="preserve">which is typically </w:t>
       </w:r>
       <w:r>
         <w:rPr>
           <w:b/>
           <w:bCs/>
-          <w:highlight w:val="yellow"/>
-        </w:rPr>
-        <w:t>6 weekdays after graded Major Projects are returned</w:t>
-      </w:r>
-      <w:r>
-        <w:rPr>
-          <w:highlight w:val="yellow"/>
-        </w:rPr>
+        </w:rPr>
+        <w:t>one week</w:t>
+      </w:r>
+      <w:r>
+        <w:rPr>
+          <w:b/>
+          <w:bCs/>
+        </w:rPr>
+        <w:t xml:space="preserve"> after graded Major Projects are returned</w:t>
+      </w:r>
+      <w:r>
         <w:t>.</w:t>
       </w:r>
       <w:r>
@@ -8558,16 +8875,10 @@
         <w:t xml:space="preserve">You’re only locked out after the </w:t>
       </w:r>
       <w:r>
-        <w:t>revision</w:t>
-      </w:r>
-      <w:r>
-        <w:t xml:space="preserve"> deadline</w:t>
-      </w:r>
-      <w:r>
-        <w:t xml:space="preserve"> passes.</w:t>
-      </w:r>
-      <w:r>
-        <w:t xml:space="preserve"> </w:t>
+        <w:t>Grace Period ends</w:t>
+      </w:r>
+      <w:r>
+        <w:t>.</w:t>
       </w:r>
     </w:p>
     <w:p>
@@ -8654,7 +8965,7 @@
         <mc:AlternateContent>
           <mc:Choice Requires="wps">
             <w:drawing>
-              <wp:anchor distT="0" distB="0" distL="114300" distR="114300" simplePos="0" relativeHeight="251666432" behindDoc="0" locked="0" layoutInCell="1" allowOverlap="1" wp14:anchorId="54298D74" wp14:editId="67DD694E">
+              <wp:anchor distT="0" distB="0" distL="114300" distR="114300" simplePos="0" relativeHeight="251666432" behindDoc="0" locked="0" layoutInCell="1" allowOverlap="1" wp14:anchorId="54298D74" wp14:editId="76A2CFC9">
                 <wp:simplePos x="0" y="0"/>
                 <wp:positionH relativeFrom="column">
                   <wp:posOffset>2533650</wp:posOffset>
@@ -8728,7 +9039,7 @@
           </mc:Choice>
           <mc:Fallback>
             <w:pict>
-              <v:rect w14:anchorId="67616155" id="Rectangle 18" o:spid="_x0000_s1026" alt="&quot;&quot;" style="position:absolute;margin-left:199.5pt;margin-top:31.75pt;width:313.5pt;height:208.8pt;z-index:251666432;visibility:visible;mso-wrap-style:square;mso-width-percent:0;mso-height-percent:0;mso-wrap-distance-left:9pt;mso-wrap-distance-top:0;mso-wrap-distance-right:9pt;mso-wrap-distance-bottom:0;mso-position-horizontal:absolute;mso-position-horizontal-relative:text;mso-position-vertical:absolute;mso-position-vertical-relative:text;mso-width-percent:0;mso-height-percent:0;mso-width-relative:margin;mso-height-relative:margin;v-text-anchor:middle" o:gfxdata="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" filled="f" strokecolor="#508590 [3209]" strokeweight="3pt"/>
+              <v:rect w14:anchorId="7EA553C8" id="Rectangle 18" o:spid="_x0000_s1026" alt="&quot;&quot;" style="position:absolute;margin-left:199.5pt;margin-top:31.75pt;width:313.5pt;height:208.8pt;z-index:251666432;visibility:visible;mso-wrap-style:square;mso-width-percent:0;mso-height-percent:0;mso-wrap-distance-left:9pt;mso-wrap-distance-top:0;mso-wrap-distance-right:9pt;mso-wrap-distance-bottom:0;mso-position-horizontal:absolute;mso-position-horizontal-relative:text;mso-position-vertical:absolute;mso-position-vertical-relative:text;mso-width-percent:0;mso-height-percent:0;mso-width-relative:margin;mso-height-relative:margin;v-text-anchor:middle" o:gfxdata="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" filled="f" strokecolor="#508590 [3209]" strokeweight="3pt"/>
             </w:pict>
           </mc:Fallback>
         </mc:AlternateContent>
@@ -8800,7 +9111,7 @@
           <w:sz w:val="28"/>
         </w:rPr>
         <w:drawing>
-          <wp:inline distT="0" distB="0" distL="0" distR="0" wp14:anchorId="6CA89510" wp14:editId="384E461D">
+          <wp:inline distT="0" distB="0" distL="0" distR="0" wp14:anchorId="6CA89510" wp14:editId="3B259D77">
             <wp:extent cx="2352675" cy="2601013"/>
             <wp:effectExtent l="38100" t="38100" r="28575" b="46990"/>
             <wp:docPr id="6" name="Image 6" descr="A person who appears to be Latina in front of a computer with an x-ray image on the screen, working in a classroom"/>
@@ -8815,7 +9126,7 @@
                     <pic:cNvPicPr/>
                   </pic:nvPicPr>
                   <pic:blipFill>
-                    <a:blip r:embed="rId30" cstate="print">
+                    <a:blip r:embed="rId31" cstate="print">
                       <a:extLst>
                         <a:ext uri="{28A0092B-C50C-407E-A947-70E740481C1C}">
                           <a14:useLocalDpi xmlns:a14="http://schemas.microsoft.com/office/drawing/2010/main" val="0"/>
@@ -11892,7 +12203,7 @@
       <w:r>
         <w:t xml:space="preserve">An </w:t>
       </w:r>
-      <w:hyperlink r:id="rId31">
+      <w:hyperlink r:id="rId32">
         <w:r>
           <w:rPr>
             <w:rStyle w:val="Hyperlink"/>
@@ -11930,7 +12241,7 @@
         <mc:AlternateContent>
           <mc:Choice Requires="wpg">
             <w:drawing>
-              <wp:inline distT="0" distB="0" distL="0" distR="0" wp14:anchorId="20FE8926" wp14:editId="665035FD">
+              <wp:inline distT="0" distB="0" distL="0" distR="0" wp14:anchorId="20FE8926" wp14:editId="6B9208D7">
                 <wp:extent cx="1036589" cy="518035"/>
                 <wp:effectExtent l="0" t="0" r="0" b="0"/>
                 <wp:docPr id="8" name="Group 8">
@@ -12402,7 +12713,7 @@
           </mc:Choice>
           <mc:Fallback>
             <w:pict>
-              <v:group w14:anchorId="59ED0913" id="Group 8" o:spid="_x0000_s1026" alt="&quot;&quot;" style="width:81.6pt;height:40.8pt;mso-position-horizontal-relative:char;mso-position-vertical-relative:line" coordsize="17678,8839" o:gfxdata="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">
+              <v:group w14:anchorId="3142E102" id="Group 8" o:spid="_x0000_s1026" alt="&quot;&quot;" style="width:81.6pt;height:40.8pt;mso-position-horizontal-relative:char;mso-position-vertical-relative:line" coordsize="17678,8839" o:gfxdata="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">
                 <v:shape id="Graphic 9" o:spid="_x0000_s1027" style="position:absolute;width:17678;height:8839;visibility:visible;mso-wrap-style:square;v-text-anchor:top" coordsize="1767839,883919" o:gfxdata="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" path="m318170,883805l,883805,1307,835313,5194,787505r6296,-46487l20384,694208,31570,648855,45056,604454,60777,561074,78663,518782,98648,477646r22017,-39914l144645,399108r25878,-37267l198229,325999r29468,-34349l258860,258860r32790,-31163l325999,198229r35842,-27706l399108,144645r38624,-23980l477646,98648,518782,78663,561074,60777,604454,45056,648855,31570,694208,20384r46239,-8817l787505,5186,835313,1307,883805,r48492,1307l980105,5186r47058,6381l1073402,20384r45354,11186l1163156,45056r43380,15721l1248828,78663r41137,19985l1329879,120665r38624,23980l1405769,170523r35842,27706l1475960,227697r32790,31163l1539913,291650r22751,26520l883805,318170r-48805,2076l787348,326361r-46330,9985l696181,350031r-43175,17214l611663,387820r-39342,23765l535152,438370r-34829,29636l468006,500323r-29636,34829l411585,572321r-23765,39342l367245,653006r-17214,43175l336346,741018r-9985,46330l320246,835000r-2076,48805xem1767611,883805r-318170,l1447378,835313r-13,-313l1441269,787505r-10005,-46487l1417580,696181r-17215,-43175l1379790,611663r-23764,-39342l1329240,535152r-29636,-34829l1267287,468006r-34828,-29636l1195289,411585r-39341,-23765l1114605,367245r-43175,-17214l1026592,336346r-46329,-9985l932610,320246r-48805,-2076l1562664,318170r34424,43671l1622965,399108r23980,38624l1668962,477646r19985,41136l1706834,561074r15720,43380l1736040,648855r11186,45353l1756043,740447r6360,46901l1766278,835000r25,313l1767611,883805xe" fillcolor="#e4741f" stroked="f">
                   <v:path arrowok="t"/>
                 </v:shape>
@@ -12433,7 +12744,7 @@
       <w:r>
         <w:t xml:space="preserve"> of global knowledge workers already use AI, according to a </w:t>
       </w:r>
-      <w:hyperlink r:id="rId32">
+      <w:hyperlink r:id="rId33">
         <w:r>
           <w:t>2024 Microsoft/LinkedIn study</w:t>
         </w:r>
@@ -12566,15 +12877,13 @@
         <w:ind w:left="0" w:right="0"/>
       </w:pPr>
       <w:r>
-        <w:t xml:space="preserve">Employees who use AI say it helps </w:t>
-      </w:r>
-      <w:proofErr w:type="gramStart"/>
-      <w:r>
-        <w:t>them .</w:t>
-      </w:r>
-      <w:proofErr w:type="gramEnd"/>
+        <w:t>Employees who use AI say it helps them</w:t>
+      </w:r>
       <w:r>
         <w:t xml:space="preserve"> .</w:t>
+      </w:r>
+      <w:r>
+        <w:t xml:space="preserve"> . .</w:t>
       </w:r>
     </w:p>
     <w:p>
@@ -12604,14 +12913,14 @@
           <w:sz w:val="28"/>
         </w:rPr>
         <w:drawing>
-          <wp:inline distT="0" distB="0" distL="0" distR="0" wp14:anchorId="111BAA6D" wp14:editId="0B1761F2">
+          <wp:inline distT="0" distB="0" distL="0" distR="0" wp14:anchorId="111BAA6D" wp14:editId="49DA49D6">
             <wp:extent cx="1619250" cy="1047750"/>
             <wp:effectExtent l="0" t="0" r="0" b="0"/>
             <wp:docPr id="721744349" name="Chart 17" descr="Pie chart showing 90% save time"/>
             <wp:cNvGraphicFramePr/>
             <a:graphic xmlns:a="http://schemas.openxmlformats.org/drawingml/2006/main">
               <a:graphicData uri="http://schemas.openxmlformats.org/drawingml/2006/chart">
-                <c:chart xmlns:c="http://schemas.openxmlformats.org/drawingml/2006/chart" xmlns:r="http://schemas.openxmlformats.org/officeDocument/2006/relationships" r:id="rId33"/>
+                <c:chart xmlns:c="http://schemas.openxmlformats.org/drawingml/2006/chart" xmlns:r="http://schemas.openxmlformats.org/officeDocument/2006/relationships" r:id="rId34"/>
               </a:graphicData>
             </a:graphic>
           </wp:inline>
@@ -12661,7 +12970,7 @@
             <wp:cNvGraphicFramePr/>
             <a:graphic xmlns:a="http://schemas.openxmlformats.org/drawingml/2006/main">
               <a:graphicData uri="http://schemas.openxmlformats.org/drawingml/2006/chart">
-                <c:chart xmlns:c="http://schemas.openxmlformats.org/drawingml/2006/chart" xmlns:r="http://schemas.openxmlformats.org/officeDocument/2006/relationships" r:id="rId34"/>
+                <c:chart xmlns:c="http://schemas.openxmlformats.org/drawingml/2006/chart" xmlns:r="http://schemas.openxmlformats.org/officeDocument/2006/relationships" r:id="rId35"/>
               </a:graphicData>
             </a:graphic>
           </wp:inline>
@@ -12716,7 +13025,7 @@
             <wp:cNvGraphicFramePr/>
             <a:graphic xmlns:a="http://schemas.openxmlformats.org/drawingml/2006/main">
               <a:graphicData uri="http://schemas.openxmlformats.org/drawingml/2006/chart">
-                <c:chart xmlns:c="http://schemas.openxmlformats.org/drawingml/2006/chart" xmlns:r="http://schemas.openxmlformats.org/officeDocument/2006/relationships" r:id="rId35"/>
+                <c:chart xmlns:c="http://schemas.openxmlformats.org/drawingml/2006/chart" xmlns:r="http://schemas.openxmlformats.org/officeDocument/2006/relationships" r:id="rId36"/>
               </a:graphicData>
             </a:graphic>
           </wp:inline>
@@ -12788,15 +13097,96 @@
     <w:p>
       <w:pPr>
         <w:pStyle w:val="Heading3"/>
-        <w:pBdr>
-          <w:top w:val="single" w:sz="24" w:space="1" w:color="508590" w:themeColor="accent6"/>
-          <w:left w:val="single" w:sz="24" w:space="4" w:color="508590" w:themeColor="accent6"/>
-          <w:bottom w:val="single" w:sz="24" w:space="1" w:color="508590" w:themeColor="accent6"/>
-          <w:right w:val="single" w:sz="24" w:space="4" w:color="508590" w:themeColor="accent6"/>
-        </w:pBdr>
         <w:ind w:left="0" w:right="0"/>
       </w:pPr>
       <w:r>
+        <w:rPr>
+          <w:noProof/>
+          <w:sz w:val="28"/>
+        </w:rPr>
+        <mc:AlternateContent>
+          <mc:Choice Requires="wps">
+            <w:drawing>
+              <wp:anchor distT="0" distB="0" distL="114300" distR="114300" simplePos="0" relativeHeight="251695104" behindDoc="0" locked="0" layoutInCell="1" allowOverlap="1" wp14:anchorId="0DEFA166" wp14:editId="61A86B7C">
+                <wp:simplePos x="0" y="0"/>
+                <wp:positionH relativeFrom="column">
+                  <wp:posOffset>-76200</wp:posOffset>
+                </wp:positionH>
+                <wp:positionV relativeFrom="paragraph">
+                  <wp:posOffset>295910</wp:posOffset>
+                </wp:positionV>
+                <wp:extent cx="3324225" cy="1514475"/>
+                <wp:effectExtent l="19050" t="19050" r="28575" b="28575"/>
+                <wp:wrapNone/>
+                <wp:docPr id="1078898821" name="Rectangle 18">
+                  <a:extLst xmlns:a="http://schemas.openxmlformats.org/drawingml/2006/main">
+                    <a:ext uri="{C183D7F6-B498-43B3-948B-1728B52AA6E4}">
+                      <adec:decorative xmlns:adec="http://schemas.microsoft.com/office/drawing/2017/decorative" val="1"/>
+                    </a:ext>
+                  </a:extLst>
+                </wp:docPr>
+                <wp:cNvGraphicFramePr/>
+                <a:graphic xmlns:a="http://schemas.openxmlformats.org/drawingml/2006/main">
+                  <a:graphicData uri="http://schemas.microsoft.com/office/word/2010/wordprocessingShape">
+                    <wps:wsp>
+                      <wps:cNvSpPr/>
+                      <wps:spPr>
+                        <a:xfrm>
+                          <a:off x="0" y="0"/>
+                          <a:ext cx="3324225" cy="1514475"/>
+                        </a:xfrm>
+                        <a:prstGeom prst="rect">
+                          <a:avLst/>
+                        </a:prstGeom>
+                        <a:noFill/>
+                        <a:ln w="38100">
+                          <a:solidFill>
+                            <a:schemeClr val="accent6"/>
+                          </a:solidFill>
+                        </a:ln>
+                      </wps:spPr>
+                      <wps:style>
+                        <a:lnRef idx="2">
+                          <a:schemeClr val="accent1">
+                            <a:shade val="15000"/>
+                          </a:schemeClr>
+                        </a:lnRef>
+                        <a:fillRef idx="1">
+                          <a:schemeClr val="accent1"/>
+                        </a:fillRef>
+                        <a:effectRef idx="0">
+                          <a:schemeClr val="accent1"/>
+                        </a:effectRef>
+                        <a:fontRef idx="minor">
+                          <a:schemeClr val="lt1"/>
+                        </a:fontRef>
+                      </wps:style>
+                      <wps:bodyPr rot="0" spcFirstLastPara="0" vertOverflow="overflow" horzOverflow="overflow" vert="horz" wrap="square" lIns="91440" tIns="45720" rIns="91440" bIns="45720" numCol="1" spcCol="0" rtlCol="0" fromWordArt="0" anchor="ctr" anchorCtr="0" forceAA="0" compatLnSpc="1">
+                        <a:prstTxWarp prst="textNoShape">
+                          <a:avLst/>
+                        </a:prstTxWarp>
+                        <a:noAutofit/>
+                      </wps:bodyPr>
+                    </wps:wsp>
+                  </a:graphicData>
+                </a:graphic>
+                <wp14:sizeRelH relativeFrom="margin">
+                  <wp14:pctWidth>0</wp14:pctWidth>
+                </wp14:sizeRelH>
+                <wp14:sizeRelV relativeFrom="margin">
+                  <wp14:pctHeight>0</wp14:pctHeight>
+                </wp14:sizeRelV>
+              </wp:anchor>
+            </w:drawing>
+          </mc:Choice>
+          <mc:Fallback>
+            <w:pict>
+              <v:rect w14:anchorId="48D5C3FB" id="Rectangle 18" o:spid="_x0000_s1026" alt="&quot;&quot;" style="position:absolute;margin-left:-6pt;margin-top:23.3pt;width:261.75pt;height:119.25pt;z-index:251695104;visibility:visible;mso-wrap-style:square;mso-width-percent:0;mso-height-percent:0;mso-wrap-distance-left:9pt;mso-wrap-distance-top:0;mso-wrap-distance-right:9pt;mso-wrap-distance-bottom:0;mso-position-horizontal:absolute;mso-position-horizontal-relative:text;mso-position-vertical:absolute;mso-position-vertical-relative:text;mso-width-percent:0;mso-height-percent:0;mso-width-relative:margin;mso-height-relative:margin;v-text-anchor:middle" o:gfxdata="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" filled="f" strokecolor="#508590 [3209]" strokeweight="3pt"/>
+            </w:pict>
+          </mc:Fallback>
+        </mc:AlternateContent>
+      </w:r>
+      <w:r>
         <w:t xml:space="preserve">Employers say . . </w:t>
       </w:r>
       <w:r>
@@ -12809,12 +13199,7 @@
     <w:p>
       <w:pPr>
         <w:pStyle w:val="BodyText"/>
-        <w:pBdr>
-          <w:top w:val="single" w:sz="24" w:space="1" w:color="508590" w:themeColor="accent6"/>
-          <w:left w:val="single" w:sz="24" w:space="4" w:color="508590" w:themeColor="accent6"/>
-          <w:bottom w:val="single" w:sz="24" w:space="1" w:color="508590" w:themeColor="accent6"/>
-          <w:right w:val="single" w:sz="24" w:space="4" w:color="508590" w:themeColor="accent6"/>
-        </w:pBdr>
+        <w:spacing w:before="240"/>
         <w:jc w:val="center"/>
       </w:pPr>
       <w:r>
@@ -12824,7 +13209,7 @@
         <mc:AlternateContent>
           <mc:Choice Requires="wpg">
             <w:drawing>
-              <wp:inline distT="0" distB="0" distL="0" distR="0" wp14:anchorId="7633FAB2" wp14:editId="42F88D2A">
+              <wp:inline distT="0" distB="0" distL="0" distR="0" wp14:anchorId="7633FAB2" wp14:editId="1AD1F3F3">
                 <wp:extent cx="2533650" cy="203013"/>
                 <wp:effectExtent l="0" t="0" r="0" b="6985"/>
                 <wp:docPr id="24" name="Group 24">
@@ -13035,7 +13420,7 @@
           </mc:Choice>
           <mc:Fallback>
             <w:pict>
-              <v:group w14:anchorId="604BE93D" id="Group 24" o:spid="_x0000_s1026" alt="&quot;&quot;" style="width:199.5pt;height:16pt;mso-position-horizontal-relative:char;mso-position-vertical-relative:line" coordsize="30035,2406" o:gfxdata="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">
+              <v:group w14:anchorId="08B6BD4E" id="Group 24" o:spid="_x0000_s1026" alt="&quot;&quot;" style="width:199.5pt;height:16pt;mso-position-horizontal-relative:char;mso-position-vertical-relative:line" coordsize="30035,2406" o:gfxdata="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">
                 <v:shape id="Graphic 25" o:spid="_x0000_s1027" style="position:absolute;width:30035;height:2406;visibility:visible;mso-wrap-style:square;v-text-anchor:top" coordsize="3003550,240665" o:gfxdata="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" path="m2883329,240277r-2763191,l73375,230836,35187,205089,9441,166902,,120138,9441,73375,35187,35187,73375,9441,120138,,2883329,r46764,9441l2968280,35187r25747,38188l3003468,120138r-9441,46764l2968280,205089r-38187,25747l2883329,240277xe" fillcolor="#e4741f" stroked="f">
                   <v:path arrowok="t"/>
                 </v:shape>
@@ -13052,12 +13437,6 @@
     <w:p>
       <w:pPr>
         <w:pStyle w:val="BodyText"/>
-        <w:pBdr>
-          <w:top w:val="single" w:sz="24" w:space="1" w:color="508590" w:themeColor="accent6"/>
-          <w:left w:val="single" w:sz="24" w:space="4" w:color="508590" w:themeColor="accent6"/>
-          <w:bottom w:val="single" w:sz="24" w:space="1" w:color="508590" w:themeColor="accent6"/>
-          <w:right w:val="single" w:sz="24" w:space="4" w:color="508590" w:themeColor="accent6"/>
-        </w:pBdr>
         <w:jc w:val="center"/>
         <w:rPr>
           <w:spacing w:val="-2"/>
@@ -13145,27 +13524,6 @@
     <w:p>
       <w:pPr>
         <w:pStyle w:val="BodyText"/>
-        <w:pBdr>
-          <w:top w:val="single" w:sz="24" w:space="1" w:color="508590" w:themeColor="accent6"/>
-          <w:left w:val="single" w:sz="24" w:space="4" w:color="508590" w:themeColor="accent6"/>
-          <w:bottom w:val="single" w:sz="24" w:space="1" w:color="508590" w:themeColor="accent6"/>
-          <w:right w:val="single" w:sz="24" w:space="4" w:color="508590" w:themeColor="accent6"/>
-        </w:pBdr>
-        <w:jc w:val="center"/>
-        <w:rPr>
-          <w:spacing w:val="-2"/>
-        </w:rPr>
-      </w:pPr>
-    </w:p>
-    <w:p>
-      <w:pPr>
-        <w:pStyle w:val="BodyText"/>
-        <w:pBdr>
-          <w:top w:val="single" w:sz="24" w:space="1" w:color="508590" w:themeColor="accent6"/>
-          <w:left w:val="single" w:sz="24" w:space="4" w:color="508590" w:themeColor="accent6"/>
-          <w:bottom w:val="single" w:sz="24" w:space="1" w:color="508590" w:themeColor="accent6"/>
-          <w:right w:val="single" w:sz="24" w:space="4" w:color="508590" w:themeColor="accent6"/>
-        </w:pBdr>
         <w:jc w:val="center"/>
       </w:pPr>
       <w:r>
@@ -13406,12 +13764,6 @@
     <w:p>
       <w:pPr>
         <w:pStyle w:val="BodyText"/>
-        <w:pBdr>
-          <w:top w:val="single" w:sz="24" w:space="1" w:color="508590" w:themeColor="accent6"/>
-          <w:left w:val="single" w:sz="24" w:space="4" w:color="508590" w:themeColor="accent6"/>
-          <w:bottom w:val="single" w:sz="24" w:space="1" w:color="508590" w:themeColor="accent6"/>
-          <w:right w:val="single" w:sz="24" w:space="4" w:color="508590" w:themeColor="accent6"/>
-        </w:pBdr>
         <w:jc w:val="center"/>
       </w:pPr>
       <w:r>
@@ -13476,15 +13828,12 @@
     <w:p>
       <w:pPr>
         <w:pStyle w:val="Heading3"/>
-        <w:pBdr>
-          <w:top w:val="single" w:sz="24" w:space="1" w:color="508590" w:themeColor="accent6"/>
-          <w:left w:val="single" w:sz="24" w:space="4" w:color="508590" w:themeColor="accent6"/>
-          <w:bottom w:val="single" w:sz="24" w:space="1" w:color="508590" w:themeColor="accent6"/>
-          <w:right w:val="single" w:sz="24" w:space="4" w:color="508590" w:themeColor="accent6"/>
-        </w:pBdr>
         <w:ind w:left="0" w:right="0"/>
       </w:pPr>
       <w:r>
+        <w:rPr>
+          <w:bdr w:val="single" w:sz="12" w:space="0" w:color="FCF1E8"/>
+        </w:rPr>
         <w:br w:type="column"/>
       </w:r>
       <w:r>
@@ -13505,7 +13854,7 @@
       <w:r>
         <w:t xml:space="preserve">Rainie, Lee, Monica Anderson, Colleen McClain, Emily A. Vogels and Risa Gelles-Watnick. (2023, April 20). </w:t>
       </w:r>
-      <w:hyperlink r:id="rId36" w:history="1">
+      <w:hyperlink r:id="rId37" w:history="1">
         <w:r>
           <w:rPr>
             <w:rStyle w:val="Hyperlink"/>
@@ -13531,7 +13880,7 @@
       <w:r>
         <w:t xml:space="preserve">Microsoft, &amp; LinkedIn. (2024, May 8). </w:t>
       </w:r>
-      <w:hyperlink r:id="rId37" w:history="1">
+      <w:hyperlink r:id="rId38" w:history="1">
         <w:r>
           <w:rPr>
             <w:rStyle w:val="Hyperlink"/>
@@ -13554,6 +13903,22 @@
           <w:cols w:num="2" w:space="720"/>
         </w:sectPr>
       </w:pPr>
+    </w:p>
+    <w:p>
+      <w:pPr>
+        <w:spacing w:line="240" w:lineRule="auto"/>
+        <w:ind w:left="0" w:right="0"/>
+        <w:rPr>
+          <w:b/>
+          <w:bCs/>
+          <w:color w:val="C64600"/>
+          <w:sz w:val="36"/>
+          <w:szCs w:val="30"/>
+        </w:rPr>
+      </w:pPr>
+      <w:r>
+        <w:br w:type="page"/>
+      </w:r>
     </w:p>
     <w:p>
       <w:pPr>
@@ -13621,19 +13986,43 @@
       <w:r>
         <w:t xml:space="preserve">You can use </w:t>
       </w:r>
-      <w:hyperlink r:id="rId38" w:history="1">
+      <w:r>
+        <w:t xml:space="preserve">any </w:t>
+      </w:r>
+      <w:hyperlink r:id="rId39" w:history="1">
         <w:r>
           <w:rPr>
             <w:rStyle w:val="Hyperlink"/>
-            <w:b/>
-            <w:bCs/>
-            <w:color w:val="C04000"/>
           </w:rPr>
-          <w:t>Copilot</w:t>
+          <w:t>tools approved by Virginia Tech</w:t>
         </w:r>
       </w:hyperlink>
       <w:r>
-        <w:t xml:space="preserve"> for assignments that require generative AI tasks. Copilot is the only AI tool officially approved by Virginia Tech because it protects your personal work when you login with your VT PID. It will not use any content you upload, so your writing will not be part of the language learning database.</w:t>
+        <w:t xml:space="preserve"> for assignments that require </w:t>
+      </w:r>
+      <w:r>
+        <w:t xml:space="preserve">or allow </w:t>
+      </w:r>
+      <w:r>
+        <w:t xml:space="preserve">generative AI tasks. </w:t>
+      </w:r>
+      <w:r>
+        <w:t>The listed tools are</w:t>
+      </w:r>
+      <w:r>
+        <w:t xml:space="preserve"> officially approved by Virginia Tech because </w:t>
+      </w:r>
+      <w:r>
+        <w:t>they</w:t>
+      </w:r>
+      <w:r>
+        <w:t xml:space="preserve"> protect your personal work when you login with your VT PID. </w:t>
+      </w:r>
+      <w:r>
+        <w:t>They</w:t>
+      </w:r>
+      <w:r>
+        <w:t xml:space="preserve"> will not use any content you upload, so your writing will not be part of the language learning database.</w:t>
       </w:r>
     </w:p>
     <w:p>
@@ -13649,15 +14038,7 @@
         <w:ind w:left="180"/>
       </w:pPr>
       <w:r>
-        <w:t xml:space="preserve">I will design our activities to be compatible with Copilot to streamline the activities I ask you to complete. You are welcome to use other AI tools that you have access to. If an alternative tool cannot accomplish an assigned </w:t>
-      </w:r>
-      <w:proofErr w:type="gramStart"/>
-      <w:r>
-        <w:t>task</w:t>
-      </w:r>
-      <w:proofErr w:type="gramEnd"/>
-      <w:r>
-        <w:t xml:space="preserve"> however, you’ll need to switch back to Copilot.</w:t>
+        <w:t>I will design our activities to be compatible with Copilot to streamline the activities I ask you to complete. You are welcome to use other AI tools that you have access to. If an alternative tool cannot accomplish an assigned task however, you’ll need to switch to Copilot.</w:t>
       </w:r>
     </w:p>
     <w:p>
@@ -13683,7 +14064,7 @@
                     <pic:cNvPicPr/>
                   </pic:nvPicPr>
                   <pic:blipFill rotWithShape="1">
-                    <a:blip r:embed="rId39" cstate="print">
+                    <a:blip r:embed="rId40" cstate="print">
                       <a:extLst>
                         <a:ext uri="{28A0092B-C50C-407E-A947-70E740481C1C}">
                           <a14:useLocalDpi xmlns:a14="http://schemas.microsoft.com/office/drawing/2010/main" val="0"/>
@@ -13808,7 +14189,13 @@
         <w:t xml:space="preserve">Brainstorming Ideas: </w:t>
       </w:r>
       <w:r>
-        <w:t>You can ask Copilot to generate a list of topics that interest you by creating a prompt that includes the assignment parameters. You can also use AI to help you evaluate the brainstormed list for the most promising ideas. </w:t>
+        <w:t xml:space="preserve">You can ask </w:t>
+      </w:r>
+      <w:r>
+        <w:t>AI chatbots</w:t>
+      </w:r>
+      <w:r>
+        <w:t xml:space="preserve"> to generate a list of topics that interest you by creating a prompt that includes the assignment parameters. You can also use AI to help you evaluate the brainstormed list for the most promising ideas. </w:t>
       </w:r>
     </w:p>
     <w:p>
@@ -13829,7 +14216,13 @@
         <w:t xml:space="preserve">Editing Checks: </w:t>
       </w:r>
       <w:r>
-        <w:t xml:space="preserve">Have AI check your draft for accuracy. Copilot can check for basic grammatical mistakes, punctuation errors, and spelling issues. Ask AI to tell you where the errors are and even what they </w:t>
+        <w:t xml:space="preserve">Have AI check your draft for accuracy. </w:t>
+      </w:r>
+      <w:r>
+        <w:t>AI chatbots</w:t>
+      </w:r>
+      <w:r>
+        <w:t xml:space="preserve"> can check for basic grammatical mistakes, punctuation errors, and spelling issues. Ask AI to tell you where the errors are and even what they </w:t>
       </w:r>
       <w:proofErr w:type="gramStart"/>
       <w:r>
@@ -13865,7 +14258,19 @@
         <w:t xml:space="preserve">Research Assistance: </w:t>
       </w:r>
       <w:r>
-        <w:t>Ask AI to help you research a topic. Copilot can help you find relevant sources and gather information. However, it's crucial to verify the accuracy and credibility of the sources and information that Copilot suggests. AI does not consistently provide real references. Always make sure the references exist and then cross-check with reliable references. </w:t>
+        <w:t xml:space="preserve">Ask AI to help you research a topic. </w:t>
+      </w:r>
+      <w:r>
+        <w:t>AI chatbots</w:t>
+      </w:r>
+      <w:r>
+        <w:t xml:space="preserve"> can help you find relevant sources and gather information. However, it's crucial to verify the accuracy and credibility of the sources and information that </w:t>
+      </w:r>
+      <w:r>
+        <w:t>AI chatbots</w:t>
+      </w:r>
+      <w:r>
+        <w:t xml:space="preserve"> suggests. AI does not consistently provide real references. Always make sure the references exist and then cross-check with reliable references. </w:t>
       </w:r>
     </w:p>
     <w:p>
@@ -13929,7 +14334,13 @@
         <w:t>Outline and Organize:</w:t>
       </w:r>
       <w:r>
-        <w:t xml:space="preserve"> Copilot can create outlines and organize your thoughts. Input your main points and ask AI to suggest a logical structure or flow for your document.</w:t>
+        <w:t xml:space="preserve"> </w:t>
+      </w:r>
+      <w:r>
+        <w:t>AI chatbots</w:t>
+      </w:r>
+      <w:r>
+        <w:t xml:space="preserve"> can create outlines and organize your thoughts. Input your main points and ask AI to suggest a logical structure or flow for your document.</w:t>
       </w:r>
     </w:p>
     <w:p>
@@ -13978,7 +14389,13 @@
         <w:t xml:space="preserve">Check Document Design: </w:t>
       </w:r>
       <w:r>
-        <w:t>Use Copilot to review design elements like layout, use of white space, font choices, and overall design effectiveness. AI can then suggest improvements to enhance readability and aesthetic appeal. Be aware however that AI may not accurately analyze visual elements. Verify its suggestions.</w:t>
+        <w:t xml:space="preserve">Use </w:t>
+      </w:r>
+      <w:r>
+        <w:t>AI chatbots</w:t>
+      </w:r>
+      <w:r>
+        <w:t xml:space="preserve"> to review design elements like layout, use of white space, font choices, and design effectiveness. AI can suggest improvements to enhance readability and aesthetic appeal. Be aware however that AI may not accurately analyze visual elements. Verify its suggestions.</w:t>
       </w:r>
     </w:p>
     <w:p>
@@ -14004,7 +14421,13 @@
         <w:shd w:val="clear" w:color="auto" w:fill="EDF3F4"/>
       </w:pPr>
       <w:r>
-        <w:t xml:space="preserve">What if I want to use Copilot in a way you haven’t mentioned? </w:t>
+        <w:t xml:space="preserve">What if I want to use </w:t>
+      </w:r>
+      <w:r>
+        <w:t>an AI chatbot</w:t>
+      </w:r>
+      <w:r>
+        <w:t xml:space="preserve"> in a way you haven’t mentioned? </w:t>
       </w:r>
     </w:p>
     <w:p>
@@ -14052,14 +14475,29 @@
         <w:spacing w:after="240"/>
       </w:pPr>
       <w:r>
-        <w:t xml:space="preserve">For most of the work in this course, you cannot ask AI to write or revise your drafts or final submissions for you. Using it to review your draft and make suggestions (as described above) is fine. Having AI do the writing or revision for you directly violates the </w:t>
-      </w:r>
-      <w:hyperlink r:id="rId40" w:history="1">
+        <w:t>Y</w:t>
+      </w:r>
+      <w:r>
+        <w:t xml:space="preserve">ou cannot ask AI to write or revise your drafts or final submissions for you. Using it to review your draft and make suggestions (as described above) is fine. Having AI do the writing or revision for you directly violates the </w:t>
+      </w:r>
+      <w:hyperlink r:id="rId41" w:history="1">
         <w:r>
           <w:rPr>
             <w:rStyle w:val="Hyperlink"/>
           </w:rPr>
-          <w:t>Cheating and Plagiarism sections of the Virginia Tech Honor Code</w:t>
+          <w:t>Cheating and Plagiarism sections of the Vir</w:t>
+        </w:r>
+        <w:r>
+          <w:rPr>
+            <w:rStyle w:val="Hyperlink"/>
+          </w:rPr>
+          <w:t>g</w:t>
+        </w:r>
+        <w:r>
+          <w:rPr>
+            <w:rStyle w:val="Hyperlink"/>
+          </w:rPr>
+          <w:t>inia Tech Honor Code</w:t>
         </w:r>
       </w:hyperlink>
       <w:r>
@@ -14084,7 +14522,13 @@
         <w:shd w:val="clear" w:color="auto" w:fill="EDF3F4"/>
       </w:pPr>
       <w:r>
-        <w:t xml:space="preserve">What if Copilot gives me incorrect information or makes other mistakes? </w:t>
+        <w:t xml:space="preserve">What if </w:t>
+      </w:r>
+      <w:r>
+        <w:t>an AI chatbot</w:t>
+      </w:r>
+      <w:r>
+        <w:t xml:space="preserve"> gives me incorrect information or makes other mistakes? </w:t>
       </w:r>
     </w:p>
     <w:p>
@@ -14148,16 +14592,14 @@
         <w:spacing w:after="240"/>
       </w:pPr>
       <w:r>
-        <w:t xml:space="preserve">When you use AI as you work on your assignments, include details on which AI tools you used and how they contributed to your work in a </w:t>
-      </w:r>
-      <w:hyperlink r:id="rId41" w:history="1">
+        <w:t xml:space="preserve">When you use AI as you work on your assignments, include details on which AI tools you used and how they contributed to your work in </w:t>
+      </w:r>
+      <w:hyperlink r:id="rId42" w:history="1">
         <w:r>
           <w:rPr>
             <w:rStyle w:val="Hyperlink"/>
-            <w:color w:val="auto"/>
-            <w:u w:val="none"/>
           </w:rPr>
-          <w:t>submission comment</w:t>
+          <w:t>a submission comment</w:t>
         </w:r>
       </w:hyperlink>
       <w:r>
@@ -14174,8 +14616,6 @@
           <w:cols w:space="720"/>
         </w:sectPr>
       </w:pPr>
-      <w:bookmarkStart w:id="8" w:name="_Key_Terms_at"/>
-      <w:bookmarkEnd w:id="8"/>
     </w:p>
     <w:p>
       <w:pPr>
@@ -14228,7 +14668,7 @@
       <w:t>2026</w:t>
     </w:r>
     <w:r>
-      <w:t xml:space="preserve"> Traci Gardner. Licensed under a Creative Commons Attribution-NonCommercial Share-Alike 4.0 International License. Created on Canva.com.</w:t>
+      <w:t xml:space="preserve"> Traci Gardner. Licensed under a Creative Commons Attribution-NonCommercial Share-Alike 4.0 International License.</w:t>
     </w:r>
     <w:r>
       <w:tab/>

</xml_diff>

<commit_message>
updated for fall 26
</commit_message>
<xml_diff>
--- a/TechComm/semester/2026-08-Fall/2026-Fall-Short Guide.docx
+++ b/TechComm/semester/2026-08-Fall/2026-Fall-Short Guide.docx
@@ -102,7 +102,7 @@
           <w:sz w:val="18"/>
           <w:szCs w:val="18"/>
         </w:rPr>
-        <w:t>6</w:t>
+        <w:t>7</w:t>
       </w:r>
       <w:r>
         <w:rPr>
@@ -1511,7 +1511,7 @@
           <w:noProof/>
         </w:rPr>
         <w:drawing>
-          <wp:anchor distT="0" distB="0" distL="114300" distR="114300" simplePos="0" relativeHeight="251689984" behindDoc="1" locked="0" layoutInCell="1" allowOverlap="1" wp14:anchorId="0481A3B1" wp14:editId="5304A052">
+          <wp:anchor distT="0" distB="0" distL="114300" distR="114300" simplePos="0" relativeHeight="251689984" behindDoc="1" locked="0" layoutInCell="1" allowOverlap="1" wp14:anchorId="0481A3B1" wp14:editId="699340B8">
             <wp:simplePos x="0" y="0"/>
             <wp:positionH relativeFrom="column">
               <wp:posOffset>4810125</wp:posOffset>
@@ -1530,7 +1530,7 @@
                 <wp:lineTo x="0" y="0"/>
               </wp:wrapPolygon>
             </wp:wrapTight>
-            <wp:docPr id="1865082654" name="Picture 28"/>
+            <wp:docPr id="1865082654" name="Picture 28" descr="HokieBird as a robotic creature with mechanical joints showing"/>
             <wp:cNvGraphicFramePr>
               <a:graphicFrameLocks xmlns:a="http://schemas.openxmlformats.org/drawingml/2006/main" noChangeAspect="1"/>
             </wp:cNvGraphicFramePr>
@@ -1538,7 +1538,7 @@
               <a:graphicData uri="http://schemas.openxmlformats.org/drawingml/2006/picture">
                 <pic:pic xmlns:pic="http://schemas.openxmlformats.org/drawingml/2006/picture">
                   <pic:nvPicPr>
-                    <pic:cNvPr id="1865082654" name="Picture 1865082654"/>
+                    <pic:cNvPr id="1865082654" name="Picture 28" descr="HokieBird as a robotic creature with mechanical joints showing"/>
                     <pic:cNvPicPr/>
                   </pic:nvPicPr>
                   <pic:blipFill>
@@ -1621,26 +1621,13 @@
         <w:ind w:left="180" w:right="90"/>
       </w:pPr>
       <w:r>
-        <w:t xml:space="preserve">Most </w:t>
-      </w:r>
-      <w:proofErr w:type="gramStart"/>
-      <w:r>
-        <w:t>frequently-asked</w:t>
-      </w:r>
-      <w:proofErr w:type="gramEnd"/>
-      <w:r>
-        <w:t xml:space="preserve"> questions can be answered by searching </w:t>
-      </w:r>
-      <w:proofErr w:type="spellStart"/>
+        <w:t xml:space="preserve">Most frequently-asked questions can be answered by searching </w:t>
+      </w:r>
       <w:r>
         <w:t>HokieBot</w:t>
       </w:r>
       <w:r>
-        <w:t>’s</w:t>
-      </w:r>
-      <w:proofErr w:type="spellEnd"/>
-      <w:r>
-        <w:t xml:space="preserve"> Notebook</w:t>
+        <w:t>’s Notebook</w:t>
       </w:r>
       <w:r>
         <w:t>. Check here first. It’s faster than waiting for Traci to answer your email.</w:t>
@@ -1700,7 +1687,6 @@
         <w:t xml:space="preserve"> on the second floor of Newman Library. You can talk to a tutor if you have a draft, an outline, or just ideas. Bring your assignment description with you. Make appointments online by setting up an account with </w:t>
       </w:r>
       <w:hyperlink r:id="rId18" w:history="1">
-        <w:proofErr w:type="spellStart"/>
         <w:r>
           <w:rPr>
             <w:rStyle w:val="Hyperlink"/>
@@ -1708,7 +1694,6 @@
           </w:rPr>
           <w:t>WCOnline</w:t>
         </w:r>
-        <w:proofErr w:type="spellEnd"/>
       </w:hyperlink>
       <w:r>
         <w:t xml:space="preserve"> or call the Writing Center director at 540-231-9270.</w:t>
@@ -4240,7 +4225,7 @@
           <w:szCs w:val="32"/>
         </w:rPr>
         <w:drawing>
-          <wp:anchor distT="0" distB="0" distL="114300" distR="114300" simplePos="0" relativeHeight="251693056" behindDoc="1" locked="0" layoutInCell="1" allowOverlap="1" wp14:anchorId="1E16486F" wp14:editId="465A8ECE">
+          <wp:anchor distT="0" distB="0" distL="114300" distR="114300" simplePos="0" relativeHeight="251693056" behindDoc="1" locked="0" layoutInCell="1" allowOverlap="1" wp14:anchorId="1E16486F" wp14:editId="10754B3E">
             <wp:simplePos x="0" y="0"/>
             <wp:positionH relativeFrom="column">
               <wp:posOffset>2476500</wp:posOffset>
@@ -4259,7 +4244,7 @@
                 <wp:lineTo x="0" y="0"/>
               </wp:wrapPolygon>
             </wp:wrapTight>
-            <wp:docPr id="1685167853" name="Picture 29"/>
+            <wp:docPr id="1685167853" name="Picture 29" descr="Pie chart showing the break down of assignments and their weights, as repeated in the text on the page"/>
             <wp:cNvGraphicFramePr>
               <a:graphicFrameLocks xmlns:a="http://schemas.openxmlformats.org/drawingml/2006/main" noChangeAspect="1"/>
             </wp:cNvGraphicFramePr>
@@ -4267,7 +4252,7 @@
               <a:graphicData uri="http://schemas.openxmlformats.org/drawingml/2006/picture">
                 <pic:pic xmlns:pic="http://schemas.openxmlformats.org/drawingml/2006/picture">
                   <pic:nvPicPr>
-                    <pic:cNvPr id="1685167853" name="Picture 1685167853"/>
+                    <pic:cNvPr id="1685167853" name="Picture 29" descr="Pie chart showing the break down of assignments and their weights, as repeated in the text on the page"/>
                     <pic:cNvPicPr/>
                   </pic:nvPicPr>
                   <pic:blipFill rotWithShape="1">
@@ -4312,7 +4297,6 @@
           </wp:anchor>
         </w:drawing>
       </w:r>
-      <w:proofErr w:type="gramStart"/>
       <w:r>
         <w:rPr>
           <w:sz w:val="32"/>
@@ -4332,15 +4316,7 @@
           <w:sz w:val="32"/>
           <w:szCs w:val="32"/>
         </w:rPr>
-        <w:t>(</w:t>
-      </w:r>
-      <w:proofErr w:type="gramEnd"/>
-      <w:r>
-        <w:rPr>
-          <w:sz w:val="32"/>
-          <w:szCs w:val="32"/>
-        </w:rPr>
-        <w:t>15%)</w:t>
+        <w:t>(15%)</w:t>
       </w:r>
     </w:p>
     <w:p>
@@ -4732,10 +4708,7 @@
         <w:t>Correspondence</w:t>
       </w:r>
       <w:r>
-        <w:t xml:space="preserve"> &amp; </w:t>
-      </w:r>
-      <w:r>
-        <w:t>Short Informational Report</w:t>
+        <w:t xml:space="preserve"> &amp; Short Informational Report</w:t>
       </w:r>
       <w:r>
         <w:t xml:space="preserve"> (</w:t>
@@ -5242,15 +5215,7 @@
         <w:t xml:space="preserve">To meet the standard, your major projects need to be ready to send out in the workplace. </w:t>
       </w:r>
       <w:r>
-        <w:t xml:space="preserve">Generally, major projects you submit need to </w:t>
-      </w:r>
-      <w:proofErr w:type="gramStart"/>
-      <w:r>
-        <w:t>do</w:t>
-      </w:r>
-      <w:proofErr w:type="gramEnd"/>
-      <w:r>
-        <w:t xml:space="preserve"> the following: </w:t>
+        <w:t xml:space="preserve">Generally, major projects you submit need to do the following: </w:t>
       </w:r>
     </w:p>
     <w:p>
@@ -5932,10 +5897,7 @@
         </w:numPr>
       </w:pPr>
       <w:r>
-        <w:t>Submit before</w:t>
-      </w:r>
-      <w:r>
-        <w:t xml:space="preserve"> the grace period ends.</w:t>
+        <w:t>Submit before the grace period ends.</w:t>
       </w:r>
     </w:p>
     <w:p>
@@ -6212,10 +6174,7 @@
         </w:numPr>
       </w:pPr>
       <w:r>
-        <w:t>Do work unrelated to the</w:t>
-      </w:r>
-      <w:r>
-        <w:t xml:space="preserve"> </w:t>
+        <w:t xml:space="preserve">Do work unrelated to the </w:t>
       </w:r>
       <w:r>
         <w:t>assignment</w:t>
@@ -7755,14 +7714,12 @@
       <w:r>
         <w:t xml:space="preserve">at 11:59 PM on </w:t>
       </w:r>
-      <w:proofErr w:type="gramStart"/>
       <w:r>
         <w:t xml:space="preserve">the </w:t>
       </w:r>
       <w:r>
         <w:t>Wednesday</w:t>
       </w:r>
-      <w:proofErr w:type="gramEnd"/>
       <w:r>
         <w:t xml:space="preserve"> following the </w:t>
       </w:r>
@@ -8780,23 +8737,10 @@
           <w:b/>
           <w:bCs/>
         </w:rPr>
-        <w:t xml:space="preserve">or </w:t>
-      </w:r>
-      <w:proofErr w:type="spellStart"/>
-      <w:r>
-        <w:rPr>
-          <w:rFonts w:ascii="Segoe UI Symbol" w:hAnsi="Segoe UI Symbol" w:cs="Segoe UI Symbol"/>
-          <w:b/>
-          <w:bCs/>
-        </w:rPr>
-        <w:t>F</w:t>
-      </w:r>
-      <w:r>
-        <w:t>will</w:t>
-      </w:r>
-      <w:proofErr w:type="spellEnd"/>
-      <w:r>
-        <w:t xml:space="preserve"> go away.</w:t>
+        <w:t>or F</w:t>
+      </w:r>
+      <w:r>
+        <w:t>will go away.</w:t>
       </w:r>
       <w:r>
         <w:t xml:space="preserve"> If it doesn’t, I’ll let you know if you can revise and resubmit. </w:t>
@@ -13081,24 +13025,6 @@
       <w:pPr>
         <w:pStyle w:val="BodyText"/>
       </w:pPr>
-    </w:p>
-    <w:p>
-      <w:pPr>
-        <w:pStyle w:val="Heading3"/>
-        <w:ind w:left="0" w:right="0"/>
-        <w:sectPr>
-          <w:type w:val="continuous"/>
-          <w:pgSz w:w="12240" w:h="15840"/>
-          <w:pgMar w:top="720" w:right="1080" w:bottom="720" w:left="1080" w:header="720" w:footer="720" w:gutter="0"/>
-          <w:cols w:space="288"/>
-        </w:sectPr>
-      </w:pPr>
-    </w:p>
-    <w:p>
-      <w:pPr>
-        <w:pStyle w:val="Heading3"/>
-        <w:ind w:left="0" w:right="0"/>
-      </w:pPr>
       <w:r>
         <w:rPr>
           <w:noProof/>
@@ -13107,18 +13033,18 @@
         <mc:AlternateContent>
           <mc:Choice Requires="wps">
             <w:drawing>
-              <wp:anchor distT="0" distB="0" distL="114300" distR="114300" simplePos="0" relativeHeight="251695104" behindDoc="0" locked="0" layoutInCell="1" allowOverlap="1" wp14:anchorId="0DEFA166" wp14:editId="61A86B7C">
+              <wp:anchor distT="0" distB="0" distL="114300" distR="114300" simplePos="0" relativeHeight="251697152" behindDoc="0" locked="0" layoutInCell="1" allowOverlap="1" wp14:anchorId="0E3060B6" wp14:editId="40222292">
                 <wp:simplePos x="0" y="0"/>
                 <wp:positionH relativeFrom="column">
-                  <wp:posOffset>-76200</wp:posOffset>
+                  <wp:posOffset>3372688</wp:posOffset>
                 </wp:positionH>
                 <wp:positionV relativeFrom="paragraph">
-                  <wp:posOffset>295910</wp:posOffset>
+                  <wp:posOffset>212851</wp:posOffset>
                 </wp:positionV>
-                <wp:extent cx="3324225" cy="1514475"/>
-                <wp:effectExtent l="19050" t="19050" r="28575" b="28575"/>
+                <wp:extent cx="3030416" cy="1814879"/>
+                <wp:effectExtent l="19050" t="19050" r="17780" b="13970"/>
                 <wp:wrapNone/>
-                <wp:docPr id="1078898821" name="Rectangle 18">
+                <wp:docPr id="1355951512" name="Rectangle 18">
                   <a:extLst xmlns:a="http://schemas.openxmlformats.org/drawingml/2006/main">
                     <a:ext uri="{C183D7F6-B498-43B3-948B-1728B52AA6E4}">
                       <adec:decorative xmlns:adec="http://schemas.microsoft.com/office/drawing/2017/decorative" val="1"/>
@@ -13133,7 +13059,7 @@
                       <wps:spPr>
                         <a:xfrm>
                           <a:off x="0" y="0"/>
-                          <a:ext cx="3324225" cy="1514475"/>
+                          <a:ext cx="3030416" cy="1814879"/>
                         </a:xfrm>
                         <a:prstGeom prst="rect">
                           <a:avLst/>
@@ -13181,11 +13107,116 @@
           </mc:Choice>
           <mc:Fallback>
             <w:pict>
-              <v:rect w14:anchorId="48D5C3FB" id="Rectangle 18" o:spid="_x0000_s1026" alt="&quot;&quot;" style="position:absolute;margin-left:-6pt;margin-top:23.3pt;width:261.75pt;height:119.25pt;z-index:251695104;visibility:visible;mso-wrap-style:square;mso-width-percent:0;mso-height-percent:0;mso-wrap-distance-left:9pt;mso-wrap-distance-top:0;mso-wrap-distance-right:9pt;mso-wrap-distance-bottom:0;mso-position-horizontal:absolute;mso-position-horizontal-relative:text;mso-position-vertical:absolute;mso-position-vertical-relative:text;mso-width-percent:0;mso-height-percent:0;mso-width-relative:margin;mso-height-relative:margin;v-text-anchor:middle" o:gfxdata="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" filled="f" strokecolor="#508590 [3209]" strokeweight="3pt"/>
+              <v:rect w14:anchorId="0D518C98" id="Rectangle 18" o:spid="_x0000_s1026" alt="&quot;&quot;" style="position:absolute;margin-left:265.55pt;margin-top:16.75pt;width:238.6pt;height:142.9pt;z-index:251697152;visibility:visible;mso-wrap-style:square;mso-width-percent:0;mso-height-percent:0;mso-wrap-distance-left:9pt;mso-wrap-distance-top:0;mso-wrap-distance-right:9pt;mso-wrap-distance-bottom:0;mso-position-horizontal:absolute;mso-position-horizontal-relative:text;mso-position-vertical:absolute;mso-position-vertical-relative:text;mso-width-percent:0;mso-height-percent:0;mso-width-relative:margin;mso-height-relative:margin;v-text-anchor:middle" o:gfxdata="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" filled="f" strokecolor="#508590 [3209]" strokeweight="3pt"/>
             </w:pict>
           </mc:Fallback>
         </mc:AlternateContent>
       </w:r>
+      <w:r>
+        <w:rPr>
+          <w:noProof/>
+          <w:sz w:val="28"/>
+        </w:rPr>
+        <mc:AlternateContent>
+          <mc:Choice Requires="wps">
+            <w:drawing>
+              <wp:anchor distT="0" distB="0" distL="114300" distR="114300" simplePos="0" relativeHeight="251695104" behindDoc="0" locked="0" layoutInCell="1" allowOverlap="1" wp14:anchorId="0DEFA166" wp14:editId="70F49D0C">
+                <wp:simplePos x="0" y="0"/>
+                <wp:positionH relativeFrom="column">
+                  <wp:posOffset>-73897</wp:posOffset>
+                </wp:positionH>
+                <wp:positionV relativeFrom="paragraph">
+                  <wp:posOffset>213897</wp:posOffset>
+                </wp:positionV>
+                <wp:extent cx="3324225" cy="1814879"/>
+                <wp:effectExtent l="19050" t="19050" r="28575" b="13970"/>
+                <wp:wrapNone/>
+                <wp:docPr id="1078898821" name="Rectangle 18">
+                  <a:extLst xmlns:a="http://schemas.openxmlformats.org/drawingml/2006/main">
+                    <a:ext uri="{C183D7F6-B498-43B3-948B-1728B52AA6E4}">
+                      <adec:decorative xmlns:adec="http://schemas.microsoft.com/office/drawing/2017/decorative" val="1"/>
+                    </a:ext>
+                  </a:extLst>
+                </wp:docPr>
+                <wp:cNvGraphicFramePr/>
+                <a:graphic xmlns:a="http://schemas.openxmlformats.org/drawingml/2006/main">
+                  <a:graphicData uri="http://schemas.microsoft.com/office/word/2010/wordprocessingShape">
+                    <wps:wsp>
+                      <wps:cNvSpPr/>
+                      <wps:spPr>
+                        <a:xfrm>
+                          <a:off x="0" y="0"/>
+                          <a:ext cx="3324225" cy="1814879"/>
+                        </a:xfrm>
+                        <a:prstGeom prst="rect">
+                          <a:avLst/>
+                        </a:prstGeom>
+                        <a:noFill/>
+                        <a:ln w="38100">
+                          <a:solidFill>
+                            <a:schemeClr val="accent6"/>
+                          </a:solidFill>
+                        </a:ln>
+                      </wps:spPr>
+                      <wps:style>
+                        <a:lnRef idx="2">
+                          <a:schemeClr val="accent1">
+                            <a:shade val="15000"/>
+                          </a:schemeClr>
+                        </a:lnRef>
+                        <a:fillRef idx="1">
+                          <a:schemeClr val="accent1"/>
+                        </a:fillRef>
+                        <a:effectRef idx="0">
+                          <a:schemeClr val="accent1"/>
+                        </a:effectRef>
+                        <a:fontRef idx="minor">
+                          <a:schemeClr val="lt1"/>
+                        </a:fontRef>
+                      </wps:style>
+                      <wps:bodyPr rot="0" spcFirstLastPara="0" vertOverflow="overflow" horzOverflow="overflow" vert="horz" wrap="square" lIns="91440" tIns="45720" rIns="91440" bIns="45720" numCol="1" spcCol="0" rtlCol="0" fromWordArt="0" anchor="ctr" anchorCtr="0" forceAA="0" compatLnSpc="1">
+                        <a:prstTxWarp prst="textNoShape">
+                          <a:avLst/>
+                        </a:prstTxWarp>
+                        <a:noAutofit/>
+                      </wps:bodyPr>
+                    </wps:wsp>
+                  </a:graphicData>
+                </a:graphic>
+                <wp14:sizeRelH relativeFrom="margin">
+                  <wp14:pctWidth>0</wp14:pctWidth>
+                </wp14:sizeRelH>
+                <wp14:sizeRelV relativeFrom="margin">
+                  <wp14:pctHeight>0</wp14:pctHeight>
+                </wp14:sizeRelV>
+              </wp:anchor>
+            </w:drawing>
+          </mc:Choice>
+          <mc:Fallback>
+            <w:pict>
+              <v:rect w14:anchorId="7A5C070C" id="Rectangle 18" o:spid="_x0000_s1026" alt="&quot;&quot;" style="position:absolute;margin-left:-5.8pt;margin-top:16.85pt;width:261.75pt;height:142.9pt;z-index:251695104;visibility:visible;mso-wrap-style:square;mso-width-percent:0;mso-height-percent:0;mso-wrap-distance-left:9pt;mso-wrap-distance-top:0;mso-wrap-distance-right:9pt;mso-wrap-distance-bottom:0;mso-position-horizontal:absolute;mso-position-horizontal-relative:text;mso-position-vertical:absolute;mso-position-vertical-relative:text;mso-width-percent:0;mso-height-percent:0;mso-width-relative:margin;mso-height-relative:margin;v-text-anchor:middle" o:gfxdata="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" filled="f" strokecolor="#508590 [3209]" strokeweight="3pt"/>
+            </w:pict>
+          </mc:Fallback>
+        </mc:AlternateContent>
+      </w:r>
+    </w:p>
+    <w:p>
+      <w:pPr>
+        <w:pStyle w:val="Heading3"/>
+        <w:ind w:left="0" w:right="0"/>
+        <w:sectPr>
+          <w:type w:val="continuous"/>
+          <w:pgSz w:w="12240" w:h="15840"/>
+          <w:pgMar w:top="720" w:right="1080" w:bottom="720" w:left="1080" w:header="720" w:footer="720" w:gutter="0"/>
+          <w:cols w:space="288"/>
+        </w:sectPr>
+      </w:pPr>
+    </w:p>
+    <w:p>
+      <w:pPr>
+        <w:pStyle w:val="Heading3"/>
+        <w:ind w:left="0" w:right="0"/>
+      </w:pPr>
       <w:r>
         <w:t xml:space="preserve">Employers say . . </w:t>
       </w:r>
@@ -13843,12 +13874,6 @@
     <w:p>
       <w:pPr>
         <w:pStyle w:val="BodyText"/>
-        <w:pBdr>
-          <w:top w:val="single" w:sz="24" w:space="1" w:color="508590" w:themeColor="accent6"/>
-          <w:left w:val="single" w:sz="24" w:space="4" w:color="508590" w:themeColor="accent6"/>
-          <w:bottom w:val="single" w:sz="24" w:space="1" w:color="508590" w:themeColor="accent6"/>
-          <w:right w:val="single" w:sz="24" w:space="4" w:color="508590" w:themeColor="accent6"/>
-        </w:pBdr>
         <w:spacing w:after="240" w:line="240" w:lineRule="auto"/>
       </w:pPr>
       <w:r>
@@ -13869,12 +13894,6 @@
     <w:p>
       <w:pPr>
         <w:pStyle w:val="BodyText"/>
-        <w:pBdr>
-          <w:top w:val="single" w:sz="24" w:space="1" w:color="508590" w:themeColor="accent6"/>
-          <w:left w:val="single" w:sz="24" w:space="4" w:color="508590" w:themeColor="accent6"/>
-          <w:bottom w:val="single" w:sz="24" w:space="1" w:color="508590" w:themeColor="accent6"/>
-          <w:right w:val="single" w:sz="24" w:space="4" w:color="508590" w:themeColor="accent6"/>
-        </w:pBdr>
         <w:spacing w:line="240" w:lineRule="auto"/>
       </w:pPr>
       <w:r>
@@ -13993,6 +14012,7 @@
         <w:r>
           <w:rPr>
             <w:rStyle w:val="Hyperlink"/>
+            <w:color w:val="C04000"/>
           </w:rPr>
           <w:t>tools approved by Virginia Tech</w:t>
         </w:r>
@@ -14222,15 +14242,7 @@
         <w:t>AI chatbots</w:t>
       </w:r>
       <w:r>
-        <w:t xml:space="preserve"> can check for basic grammatical mistakes, punctuation errors, and spelling issues. Ask AI to tell you where the errors are and even what they </w:t>
-      </w:r>
-      <w:proofErr w:type="gramStart"/>
-      <w:r>
-        <w:t>are, but</w:t>
-      </w:r>
-      <w:proofErr w:type="gramEnd"/>
-      <w:r>
-        <w:t xml:space="preserve"> make updates yourself. Do not have AI correct your work.</w:t>
+        <w:t xml:space="preserve"> can check for basic grammatical mistakes, punctuation errors, and spelling issues. Ask AI to tell you where the errors are and even what they are, but make updates yourself. Do not have AI correct your work.</w:t>
       </w:r>
     </w:p>
     <w:p>
@@ -14485,19 +14497,7 @@
           <w:rPr>
             <w:rStyle w:val="Hyperlink"/>
           </w:rPr>
-          <w:t>Cheating and Plagiarism sections of the Vir</w:t>
-        </w:r>
-        <w:r>
-          <w:rPr>
-            <w:rStyle w:val="Hyperlink"/>
-          </w:rPr>
-          <w:t>g</w:t>
-        </w:r>
-        <w:r>
-          <w:rPr>
-            <w:rStyle w:val="Hyperlink"/>
-          </w:rPr>
-          <w:t>inia Tech Honor Code</w:t>
+          <w:t>Cheating and Plagiarism sections of the Virginia Tech Honor Code</w:t>
         </w:r>
       </w:hyperlink>
       <w:r>
@@ -14598,6 +14598,7 @@
         <w:r>
           <w:rPr>
             <w:rStyle w:val="Hyperlink"/>
+            <w:color w:val="C04000"/>
           </w:rPr>
           <w:t>a submission comment</w:t>
         </w:r>

</xml_diff>

<commit_message>
updating references to syllabus and policies documents
</commit_message>
<xml_diff>
--- a/TechComm/semester/2026-08-Fall/2026-Fall-Short Guide.docx
+++ b/TechComm/semester/2026-08-Fall/2026-Fall-Short Guide.docx
@@ -1231,7 +1231,6 @@
         <w:r>
           <w:rPr>
             <w:rStyle w:val="Hyperlink"/>
-            <w:color w:val="C04000"/>
           </w:rPr>
           <w:t>the Late Policy &amp; Grace Period</w:t>
         </w:r>
@@ -1601,31 +1600,7 @@
           <w:rPr>
             <w:rStyle w:val="Hyperlink"/>
           </w:rPr>
-          <w:t>Gemini N</w:t>
-        </w:r>
-        <w:r>
-          <w:rPr>
-            <w:rStyle w:val="Hyperlink"/>
-          </w:rPr>
-          <w:t>o</w:t>
-        </w:r>
-        <w:r>
-          <w:rPr>
-            <w:rStyle w:val="Hyperlink"/>
-          </w:rPr>
-          <w:t>teb</w:t>
-        </w:r>
-        <w:r>
-          <w:rPr>
-            <w:rStyle w:val="Hyperlink"/>
-          </w:rPr>
-          <w:t>o</w:t>
-        </w:r>
-        <w:r>
-          <w:rPr>
-            <w:rStyle w:val="Hyperlink"/>
-          </w:rPr>
-          <w:t>ok for the course</w:t>
+          <w:t>Gemini Notebook for the course</w:t>
         </w:r>
       </w:hyperlink>
       <w:r>
@@ -2616,7 +2591,7 @@
         <w:t xml:space="preserve"> in the left menu in Canvas</w:t>
       </w:r>
       <w:r>
-        <w:t xml:space="preserve">, and then </w:t>
+        <w:t xml:space="preserve">, and </w:t>
       </w:r>
       <w:r>
         <w:rPr>
@@ -2624,7 +2599,7 @@
           <w:bCs/>
           <w:color w:val="C64600"/>
         </w:rPr>
-        <w:t xml:space="preserve">begin with the Module </w:t>
+        <w:t xml:space="preserve">begin with the </w:t>
       </w:r>
       <w:r>
         <w:rPr>
@@ -2632,15 +2607,7 @@
           <w:bCs/>
           <w:color w:val="C64600"/>
         </w:rPr>
-        <w:t>I</w:t>
-      </w:r>
-      <w:r>
-        <w:rPr>
-          <w:b/>
-          <w:bCs/>
-          <w:color w:val="C64600"/>
-        </w:rPr>
-        <w:t>ntroduction page</w:t>
+        <w:t>Week’s Newsletter</w:t>
       </w:r>
       <w:r>
         <w:rPr>
@@ -4256,7 +4223,7 @@
           <w:szCs w:val="32"/>
         </w:rPr>
         <w:drawing>
-          <wp:anchor distT="0" distB="0" distL="114300" distR="114300" simplePos="0" relativeHeight="251693056" behindDoc="1" locked="0" layoutInCell="1" allowOverlap="1" wp14:anchorId="1E16486F" wp14:editId="1879C338">
+          <wp:anchor distT="0" distB="0" distL="114300" distR="114300" simplePos="0" relativeHeight="251693056" behindDoc="1" locked="0" layoutInCell="1" allowOverlap="1" wp14:anchorId="1E16486F" wp14:editId="5F3029AC">
             <wp:simplePos x="0" y="0"/>
             <wp:positionH relativeFrom="column">
               <wp:posOffset>2476500</wp:posOffset>
@@ -4570,7 +4537,7 @@
               </wp:anchor>
             </w:drawing>
           </mc:Choice>
-          <mc:Fallback xmlns:w16cei="http://schemas.microsoft.com/office/word/2026/wordml/cei">
+          <mc:Fallback>
             <w:pict>
               <v:shapetype w14:anchorId="7ADBD669" id="_x0000_t202" coordsize="21600,21600" o:spt="202" path="m,l,21600r21600,l21600,xe">
                 <v:stroke joinstyle="miter"/>
@@ -5498,6 +5465,13 @@
           <w:bCs/>
         </w:rPr>
         <w:t xml:space="preserve"> Revision grades are capped at 90.</w:t>
+      </w:r>
+      <w:r>
+        <w:rPr>
+          <w:b/>
+          <w:bCs/>
+        </w:rPr>
+        <w:br/>
       </w:r>
     </w:p>
     <w:p>
@@ -8059,16 +8033,16 @@
         <mc:AlternateContent>
           <mc:Choice Requires="wps">
             <w:drawing>
-              <wp:anchor distT="0" distB="0" distL="114300" distR="114300" simplePos="0" relativeHeight="251682816" behindDoc="0" locked="0" layoutInCell="1" allowOverlap="1" wp14:anchorId="11656D2A" wp14:editId="4E0D13E0">
+              <wp:anchor distT="0" distB="0" distL="114300" distR="114300" simplePos="0" relativeHeight="251682816" behindDoc="0" locked="0" layoutInCell="1" allowOverlap="1" wp14:anchorId="11656D2A" wp14:editId="24C8CB3C">
                 <wp:simplePos x="0" y="0"/>
                 <wp:positionH relativeFrom="column">
-                  <wp:posOffset>47625</wp:posOffset>
+                  <wp:posOffset>46683</wp:posOffset>
                 </wp:positionH>
                 <wp:positionV relativeFrom="paragraph">
-                  <wp:posOffset>41275</wp:posOffset>
+                  <wp:posOffset>45043</wp:posOffset>
                 </wp:positionV>
-                <wp:extent cx="3629025" cy="2743200"/>
-                <wp:effectExtent l="19050" t="19050" r="28575" b="19050"/>
+                <wp:extent cx="3629025" cy="2694005"/>
+                <wp:effectExtent l="19050" t="19050" r="28575" b="11430"/>
                 <wp:wrapNone/>
                 <wp:docPr id="1193042770" name="Rectangle 31">
                   <a:extLst xmlns:a="http://schemas.openxmlformats.org/drawingml/2006/main">
@@ -8085,7 +8059,7 @@
                       <wps:spPr>
                         <a:xfrm>
                           <a:off x="0" y="0"/>
-                          <a:ext cx="3629025" cy="2743200"/>
+                          <a:ext cx="3629025" cy="2694005"/>
                         </a:xfrm>
                         <a:prstGeom prst="rect">
                           <a:avLst/>
@@ -8129,9 +8103,9 @@
               </wp:anchor>
             </w:drawing>
           </mc:Choice>
-          <mc:Fallback xmlns:w16cei="http://schemas.microsoft.com/office/word/2026/wordml/cei">
+          <mc:Fallback>
             <w:pict>
-              <v:rect w14:anchorId="6926DF8F" id="Rectangle 31" o:spid="_x0000_s1026" alt="&quot;&quot;" style="position:absolute;margin-left:3.75pt;margin-top:3.25pt;width:285.75pt;height:3in;z-index:251682816;visibility:visible;mso-wrap-style:square;mso-width-percent:0;mso-height-percent:0;mso-wrap-distance-left:9pt;mso-wrap-distance-top:0;mso-wrap-distance-right:9pt;mso-wrap-distance-bottom:0;mso-position-horizontal:absolute;mso-position-horizontal-relative:text;mso-position-vertical:absolute;mso-position-vertical-relative:text;mso-width-percent:0;mso-height-percent:0;mso-width-relative:margin;mso-height-relative:margin;v-text-anchor:middle" o:gfxdata="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" filled="f" strokecolor="#508590 [3209]" strokeweight="3pt"/>
+              <v:rect w14:anchorId="6E985B08" id="Rectangle 31" o:spid="_x0000_s1026" alt="&quot;&quot;" style="position:absolute;margin-left:3.7pt;margin-top:3.55pt;width:285.75pt;height:212.15pt;z-index:251682816;visibility:visible;mso-wrap-style:square;mso-width-percent:0;mso-height-percent:0;mso-wrap-distance-left:9pt;mso-wrap-distance-top:0;mso-wrap-distance-right:9pt;mso-wrap-distance-bottom:0;mso-position-horizontal:absolute;mso-position-horizontal-relative:text;mso-position-vertical:absolute;mso-position-vertical-relative:text;mso-width-percent:0;mso-height-percent:0;mso-width-relative:margin;mso-height-relative:margin;v-text-anchor:middle" o:gfxdata="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" filled="f" strokecolor="#508590 [3209]" strokeweight="3pt"/>
             </w:pict>
           </mc:Fallback>
         </mc:AlternateContent>
@@ -8293,7 +8267,7 @@
           <w:noProof/>
         </w:rPr>
         <w:drawing>
-          <wp:inline distT="0" distB="0" distL="0" distR="0" wp14:anchorId="3F072D2B" wp14:editId="6314D075">
+          <wp:inline distT="0" distB="0" distL="0" distR="0" wp14:anchorId="3F072D2B" wp14:editId="691B80FC">
             <wp:extent cx="2466975" cy="2705100"/>
             <wp:effectExtent l="38100" t="38100" r="47625" b="38100"/>
             <wp:docPr id="1773590568" name="Picture 11" descr="A person revising on a laptop, sitting in a coffeeshop"/>

</xml_diff>